<commit_message>
Track user ownership in core transactions
Adds `user_id` ownership to `purchase`, `sale`, and `expense` with foreign keys to `app_user`, plus user/date indexes for reporting. Introduces `app_user.is_active` for soft deactivation and updates schema comments to enforce session-based actor attribution and no hard-deletes for users with history. Seed data was expanded to include explicit user mappings, additional transactions/lots/payments/expenses, and matching updates to the requirements document and ER diagram.
</commit_message>
<xml_diff>
--- a/documentation/GMS_Requirement_Analysis_and_Design.docx
+++ b/documentation/GMS_Requirement_Analysis_and_Design.docx
@@ -7,6 +7,8 @@
         <w:spacing w:after="80"/>
         <w:jc w:val="center"/>
       </w:pPr>
+      <w:bookmarkStart w:id="0" w:name="_GoBack"/>
+      <w:bookmarkEnd w:id="0"/>
       <w:r>
         <w:rPr>
           <w:rFonts w:cs="Calibri"/>
@@ -79,12 +81,6 @@
         <w:gridCol w:w="2520"/>
       </w:tblGrid>
       <w:tr>
-        <w:tblPrEx>
-          <w:tblCellMar>
-            <w:top w:w="0" w:type="dxa"/>
-            <w:bottom w:w="0" w:type="dxa"/>
-          </w:tblCellMar>
-        </w:tblPrEx>
         <w:trPr>
           <w:cantSplit/>
           <w:tblHeader/>
@@ -184,12 +180,6 @@
         </w:tc>
       </w:tr>
       <w:tr>
-        <w:tblPrEx>
-          <w:tblCellMar>
-            <w:top w:w="0" w:type="dxa"/>
-            <w:bottom w:w="0" w:type="dxa"/>
-          </w:tblCellMar>
-        </w:tblPrEx>
         <w:trPr>
           <w:cantSplit/>
         </w:trPr>
@@ -270,15 +260,7 @@
                 <w:sz w:val="20"/>
                 <w:szCs w:val="20"/>
               </w:rPr>
-              <w:t>O</w:t>
-            </w:r>
-            <w:r>
-              <w:rPr>
-                <w:rFonts w:cs="Calibri"/>
-                <w:sz w:val="20"/>
-                <w:szCs w:val="20"/>
-              </w:rPr>
-              <w:t>ctober 2026</w:t>
+              <w:t>October 2026</w:t>
             </w:r>
           </w:p>
         </w:tc>
@@ -312,12 +294,6 @@
         <w:gridCol w:w="2400"/>
       </w:tblGrid>
       <w:tr>
-        <w:tblPrEx>
-          <w:tblCellMar>
-            <w:top w:w="0" w:type="dxa"/>
-            <w:bottom w:w="0" w:type="dxa"/>
-          </w:tblCellMar>
-        </w:tblPrEx>
         <w:trPr>
           <w:cantSplit/>
           <w:tblHeader/>
@@ -417,12 +393,6 @@
         </w:tc>
       </w:tr>
       <w:tr>
-        <w:tblPrEx>
-          <w:tblCellMar>
-            <w:top w:w="0" w:type="dxa"/>
-            <w:bottom w:w="0" w:type="dxa"/>
-          </w:tblCellMar>
-        </w:tblPrEx>
         <w:trPr>
           <w:cantSplit/>
         </w:trPr>
@@ -509,12 +479,6 @@
         </w:tc>
       </w:tr>
       <w:tr>
-        <w:tblPrEx>
-          <w:tblCellMar>
-            <w:top w:w="0" w:type="dxa"/>
-            <w:bottom w:w="0" w:type="dxa"/>
-          </w:tblCellMar>
-        </w:tblPrEx>
         <w:trPr>
           <w:cantSplit/>
         </w:trPr>
@@ -623,13 +587,7 @@
         <w:rPr>
           <w:rFonts w:cs="Calibri"/>
         </w:rPr>
-        <w:t xml:space="preserve">Sufian Store is a neighbourhood grocery (mudir dokan) at Islamnagar, Gollamari, Khulna. The owner runs everything in paper ledgers: stock is counted by eye, bills are handwritten cash memos, supplier dues are remembered, and monthly profit is guessed. The </w:t>
-      </w:r>
-      <w:r>
-        <w:rPr>
-          <w:rFonts w:cs="Calibri"/>
-        </w:rPr>
-        <w:t>goal of this project is a simple computer system where the owner, manager and cashier can record products, purchases, sales, customers, suppliers and expenses, and see stock, dues, expiry and profit at a glance.</w:t>
+        <w:t>Sufian Store is a neighbourhood grocery (mudir dokan) at Islamnagar, Gollamari, Khulna. The owner runs everything in paper ledgers: stock is counted by eye, bills are handwritten cash memos, supplier dues are remembered, and monthly profit is guessed. The goal of this project is a simple computer system where the owner, manager and cashier can record products, purchases, sales, customers, suppliers and expenses, and see stock, dues, expiry and profit at a glance.</w:t>
       </w:r>
     </w:p>
     <w:p>
@@ -649,13 +607,7 @@
         <w:rPr>
           <w:rFonts w:cs="Calibri"/>
         </w:rPr>
-        <w:t xml:space="preserve">We </w:t>
-      </w:r>
-      <w:r>
-        <w:rPr>
-          <w:rFonts w:cs="Calibri"/>
-        </w:rPr>
-        <w:t>prepared the following questions; answers below are from the shop owner.</w:t>
+        <w:t>We prepared the following questions; answers below are from the shop owner.</w:t>
       </w:r>
     </w:p>
     <w:p>
@@ -744,15 +696,7 @@
           <w:b/>
           <w:bCs/>
         </w:rPr>
-        <w:t>Q4. Do you sell on</w:t>
-      </w:r>
-      <w:r>
-        <w:rPr>
-          <w:rFonts w:cs="Calibri"/>
-          <w:b/>
-          <w:bCs/>
-        </w:rPr>
-        <w:t xml:space="preserve"> credit (baki)?</w:t>
+        <w:t>Q4. Do you sell on credit (baki)?</w:t>
       </w:r>
     </w:p>
     <w:p>
@@ -838,13 +782,7 @@
         <w:rPr>
           <w:rFonts w:cs="Calibri"/>
         </w:rPr>
-        <w:t>A: Today's sales and cash, who still owes money (due), low-stock list, monthly profit</w:t>
-      </w:r>
-      <w:r>
-        <w:rPr>
-          <w:rFonts w:cs="Calibri"/>
-        </w:rPr>
-        <w:t>.</w:t>
+        <w:t>A: Today's sales and cash, who still owes money (due), low-stock list, monthly profit.</w:t>
       </w:r>
     </w:p>
     <w:p>
@@ -890,19 +828,7 @@
         <w:rPr>
           <w:rFonts w:cs="Calibri"/>
         </w:rPr>
-        <w:t xml:space="preserve">Opening: purpose of the project and permission to take notes. Questions: walk me through a </w:t>
-      </w:r>
-      <w:r>
-        <w:rPr>
-          <w:rFonts w:cs="Calibri"/>
-        </w:rPr>
-        <w:t>normal day from opening to closing; show me the purchase notebook and a cash memo; who are your suppliers and how do you pay them; which products expire or go out of stock most; what would you check first on a computer screen in the morning? Closing: confi</w:t>
-      </w:r>
-      <w:r>
-        <w:rPr>
-          <w:rFonts w:cs="Calibri"/>
-        </w:rPr>
-        <w:t>rm the three user roles and thank the owner.</w:t>
+        <w:t>Opening: purpose of the project and permission to take notes. Questions: walk me through a normal day from opening to closing; show me the purchase notebook and a cash memo; who are your suppliers and how do you pay them; which products expire or go out of stock most; what would you check first on a computer screen in the morning? Closing: confirm the three user roles and thank the owner.</w:t>
       </w:r>
     </w:p>
     <w:p>
@@ -913,13 +839,7 @@
         <w:rPr>
           <w:rFonts w:cs="Calibri"/>
         </w:rPr>
-        <w:t>Summary of findings: (1) billing must be fast — one screen, printable memo; (2) partial payment is normal, so every bill must record the cash received and the remaining due; (3) stock must update automatically o</w:t>
-      </w:r>
-      <w:r>
-        <w:rPr>
-          <w:rFonts w:cs="Calibri"/>
-        </w:rPr>
-        <w:t>n purchase and sale; (4) expiry warning within 30 days; (5) cashier must not see profit, purchase cost or expenses; (6) the same product bought on different days has a different cost and expiry, so stock is tracked batch by batch.</w:t>
+        <w:t>Summary of findings: (1) billing must be fast — one screen, printable memo; (2) partial payment is normal, so every bill must record the cash received and the remaining due; (3) stock must update automatically on purchase and sale; (4) expiry warning within 30 days; (5) cashier must not see profit, purchase cost or expenses; (6) the same product bought on different days has a different cost and expiry, so stock is tracked batch by batch.</w:t>
       </w:r>
     </w:p>
     <w:p>
@@ -928,10 +848,7 @@
         <w:keepNext/>
       </w:pPr>
       <w:r>
-        <w:t>1.3 Observations (shop vi</w:t>
-      </w:r>
-      <w:r>
-        <w:t>sit)</w:t>
+        <w:t>1.3 Observations (shop visit)</w:t>
       </w:r>
     </w:p>
     <w:p>
@@ -970,10 +887,7 @@
         <w:spacing w:after="60"/>
       </w:pPr>
       <w:r>
-        <w:t>Supplier vans arrive week</w:t>
-      </w:r>
-      <w:r>
-        <w:t>ly with a challan (memo) showing item, quantity and rate — matches the purchase entry screen, where each line becomes one stock batch.</w:t>
+        <w:t>Supplier vans arrive weekly with a challan (memo) showing item, quantity and rate — matches the purchase entry screen, where each line becomes one stock batch.</w:t>
       </w:r>
     </w:p>
     <w:p>
@@ -986,10 +900,7 @@
         <w:spacing w:after="60"/>
       </w:pPr>
       <w:r>
-        <w:t>Regular customers buy on credit and pay later, often in several instalments — matches customer records plus a payment his</w:t>
-      </w:r>
-      <w:r>
-        <w:t>tory per bill.</w:t>
+        <w:t>Regular customers buy on credit and pay later, often in several instalments — matches customer records plus a payment history per bill.</w:t>
       </w:r>
     </w:p>
     <w:p>
@@ -1037,10 +948,7 @@
         <w:spacing w:after="60"/>
       </w:pPr>
       <w:r>
-        <w:t>Handwritten cash memo (date, items, total, cash, signatu</w:t>
-      </w:r>
-      <w:r>
-        <w:t>re).</w:t>
+        <w:t>Handwritten cash memo (date, items, total, cash, signature).</w:t>
       </w:r>
     </w:p>
     <w:p>
@@ -1101,12 +1009,6 @@
         <w:gridCol w:w="4026"/>
       </w:tblGrid>
       <w:tr>
-        <w:tblPrEx>
-          <w:tblCellMar>
-            <w:top w:w="0" w:type="dxa"/>
-            <w:bottom w:w="0" w:type="dxa"/>
-          </w:tblCellMar>
-        </w:tblPrEx>
         <w:trPr>
           <w:cantSplit/>
           <w:tblHeader/>
@@ -1206,12 +1108,6 @@
         </w:tc>
       </w:tr>
       <w:tr>
-        <w:tblPrEx>
-          <w:tblCellMar>
-            <w:top w:w="0" w:type="dxa"/>
-            <w:bottom w:w="0" w:type="dxa"/>
-          </w:tblCellMar>
-        </w:tblPrEx>
         <w:trPr>
           <w:cantSplit/>
         </w:trPr>
@@ -1298,12 +1194,6 @@
         </w:tc>
       </w:tr>
       <w:tr>
-        <w:tblPrEx>
-          <w:tblCellMar>
-            <w:top w:w="0" w:type="dxa"/>
-            <w:bottom w:w="0" w:type="dxa"/>
-          </w:tblCellMar>
-        </w:tblPrEx>
         <w:trPr>
           <w:cantSplit/>
         </w:trPr>
@@ -1393,12 +1283,6 @@
         </w:tc>
       </w:tr>
       <w:tr>
-        <w:tblPrEx>
-          <w:tblCellMar>
-            <w:top w:w="0" w:type="dxa"/>
-            <w:bottom w:w="0" w:type="dxa"/>
-          </w:tblCellMar>
-        </w:tblPrEx>
         <w:trPr>
           <w:cantSplit/>
         </w:trPr>
@@ -1485,12 +1369,6 @@
         </w:tc>
       </w:tr>
       <w:tr>
-        <w:tblPrEx>
-          <w:tblCellMar>
-            <w:top w:w="0" w:type="dxa"/>
-            <w:bottom w:w="0" w:type="dxa"/>
-          </w:tblCellMar>
-        </w:tblPrEx>
         <w:trPr>
           <w:cantSplit/>
         </w:trPr>
@@ -1580,12 +1458,6 @@
         </w:tc>
       </w:tr>
       <w:tr>
-        <w:tblPrEx>
-          <w:tblCellMar>
-            <w:top w:w="0" w:type="dxa"/>
-            <w:bottom w:w="0" w:type="dxa"/>
-          </w:tblCellMar>
-        </w:tblPrEx>
         <w:trPr>
           <w:cantSplit/>
         </w:trPr>
@@ -1672,12 +1544,6 @@
         </w:tc>
       </w:tr>
       <w:tr>
-        <w:tblPrEx>
-          <w:tblCellMar>
-            <w:top w:w="0" w:type="dxa"/>
-            <w:bottom w:w="0" w:type="dxa"/>
-          </w:tblCellMar>
-        </w:tblPrEx>
         <w:trPr>
           <w:cantSplit/>
         </w:trPr>
@@ -1767,12 +1633,6 @@
         </w:tc>
       </w:tr>
       <w:tr>
-        <w:tblPrEx>
-          <w:tblCellMar>
-            <w:top w:w="0" w:type="dxa"/>
-            <w:bottom w:w="0" w:type="dxa"/>
-          </w:tblCellMar>
-        </w:tblPrEx>
         <w:trPr>
           <w:cantSplit/>
         </w:trPr>
@@ -1860,12 +1720,6 @@
         </w:tc>
       </w:tr>
       <w:tr>
-        <w:tblPrEx>
-          <w:tblCellMar>
-            <w:top w:w="0" w:type="dxa"/>
-            <w:bottom w:w="0" w:type="dxa"/>
-          </w:tblCellMar>
-        </w:tblPrEx>
         <w:trPr>
           <w:cantSplit/>
         </w:trPr>
@@ -1955,12 +1809,6 @@
         </w:tc>
       </w:tr>
       <w:tr>
-        <w:tblPrEx>
-          <w:tblCellMar>
-            <w:top w:w="0" w:type="dxa"/>
-            <w:bottom w:w="0" w:type="dxa"/>
-          </w:tblCellMar>
-        </w:tblPrEx>
         <w:trPr>
           <w:cantSplit/>
         </w:trPr>
@@ -2077,13 +1925,7 @@
         <w:rPr>
           <w:rFonts w:cs="Calibri"/>
         </w:rPr>
-        <w:t>The diagram below shows all entities, attributes and relationships of the system. Primary key at</w:t>
-      </w:r>
-      <w:r>
-        <w:rPr>
-          <w:rFonts w:cs="Calibri"/>
-        </w:rPr>
-        <w:t>tributes are bold and underlined; foreign key attributes are in italics. The diamonds are relationships with their cardinality (1 : M).</w:t>
+        <w:t>The diagram below shows all entities, attributes and relationships of the system. Primary key attributes are bold and underlined; foreign key attributes are in italics. The diamonds are relationships with their cardinality (1 : M).</w:t>
       </w:r>
     </w:p>
     <w:p>
@@ -2098,7 +1940,7 @@
         </w:rPr>
         <w:drawing>
           <wp:inline distT="0" distB="0" distL="0" distR="0">
-            <wp:extent cx="8382000" cy="5133975"/>
+            <wp:extent cx="8382000" cy="5108953"/>
             <wp:effectExtent l="0" t="0" r="0" b="0"/>
             <wp:docPr id="1" name="er" descr="ER diagram of the Grocery Management System" title="ER diagram"/>
             <wp:cNvGraphicFramePr>
@@ -2123,7 +1965,7 @@
                   <pic:spPr bwMode="auto">
                     <a:xfrm>
                       <a:off x="0" y="0"/>
-                      <a:ext cx="8382000" cy="5133975"/>
+                      <a:ext cx="8382000" cy="5108953"/>
                     </a:xfrm>
                     <a:prstGeom prst="rect">
                       <a:avLst/>
@@ -2195,12 +2037,6 @@
         <w:gridCol w:w="4626"/>
       </w:tblGrid>
       <w:tr>
-        <w:tblPrEx>
-          <w:tblCellMar>
-            <w:top w:w="0" w:type="dxa"/>
-            <w:bottom w:w="0" w:type="dxa"/>
-          </w:tblCellMar>
-        </w:tblPrEx>
         <w:trPr>
           <w:cantSplit/>
           <w:tblHeader/>
@@ -2300,12 +2136,6 @@
         </w:tc>
       </w:tr>
       <w:tr>
-        <w:tblPrEx>
-          <w:tblCellMar>
-            <w:top w:w="0" w:type="dxa"/>
-            <w:bottom w:w="0" w:type="dxa"/>
-          </w:tblCellMar>
-        </w:tblPrEx>
         <w:trPr>
           <w:cantSplit/>
         </w:trPr>
@@ -2392,12 +2222,6 @@
         </w:tc>
       </w:tr>
       <w:tr>
-        <w:tblPrEx>
-          <w:tblCellMar>
-            <w:top w:w="0" w:type="dxa"/>
-            <w:bottom w:w="0" w:type="dxa"/>
-          </w:tblCellMar>
-        </w:tblPrEx>
         <w:trPr>
           <w:cantSplit/>
         </w:trPr>
@@ -2487,12 +2311,6 @@
         </w:tc>
       </w:tr>
       <w:tr>
-        <w:tblPrEx>
-          <w:tblCellMar>
-            <w:top w:w="0" w:type="dxa"/>
-            <w:bottom w:w="0" w:type="dxa"/>
-          </w:tblCellMar>
-        </w:tblPrEx>
         <w:trPr>
           <w:cantSplit/>
         </w:trPr>
@@ -2579,12 +2397,6 @@
         </w:tc>
       </w:tr>
       <w:tr>
-        <w:tblPrEx>
-          <w:tblCellMar>
-            <w:top w:w="0" w:type="dxa"/>
-            <w:bottom w:w="0" w:type="dxa"/>
-          </w:tblCellMar>
-        </w:tblPrEx>
         <w:trPr>
           <w:cantSplit/>
         </w:trPr>
@@ -2674,12 +2486,6 @@
         </w:tc>
       </w:tr>
       <w:tr>
-        <w:tblPrEx>
-          <w:tblCellMar>
-            <w:top w:w="0" w:type="dxa"/>
-            <w:bottom w:w="0" w:type="dxa"/>
-          </w:tblCellMar>
-        </w:tblPrEx>
         <w:trPr>
           <w:cantSplit/>
         </w:trPr>
@@ -2766,12 +2572,6 @@
         </w:tc>
       </w:tr>
       <w:tr>
-        <w:tblPrEx>
-          <w:tblCellMar>
-            <w:top w:w="0" w:type="dxa"/>
-            <w:bottom w:w="0" w:type="dxa"/>
-          </w:tblCellMar>
-        </w:tblPrEx>
         <w:trPr>
           <w:cantSplit/>
         </w:trPr>
@@ -2861,12 +2661,6 @@
         </w:tc>
       </w:tr>
       <w:tr>
-        <w:tblPrEx>
-          <w:tblCellMar>
-            <w:top w:w="0" w:type="dxa"/>
-            <w:bottom w:w="0" w:type="dxa"/>
-          </w:tblCellMar>
-        </w:tblPrEx>
         <w:trPr>
           <w:cantSplit/>
         </w:trPr>
@@ -2953,12 +2747,6 @@
         </w:tc>
       </w:tr>
       <w:tr>
-        <w:tblPrEx>
-          <w:tblCellMar>
-            <w:top w:w="0" w:type="dxa"/>
-            <w:bottom w:w="0" w:type="dxa"/>
-          </w:tblCellMar>
-        </w:tblPrEx>
         <w:trPr>
           <w:cantSplit/>
         </w:trPr>
@@ -3048,12 +2836,6 @@
         </w:tc>
       </w:tr>
       <w:tr>
-        <w:tblPrEx>
-          <w:tblCellMar>
-            <w:top w:w="0" w:type="dxa"/>
-            <w:bottom w:w="0" w:type="dxa"/>
-          </w:tblCellMar>
-        </w:tblPrEx>
         <w:trPr>
           <w:cantSplit/>
         </w:trPr>
@@ -3140,12 +2922,6 @@
         </w:tc>
       </w:tr>
       <w:tr>
-        <w:tblPrEx>
-          <w:tblCellMar>
-            <w:top w:w="0" w:type="dxa"/>
-            <w:bottom w:w="0" w:type="dxa"/>
-          </w:tblCellMar>
-        </w:tblPrEx>
         <w:trPr>
           <w:cantSplit/>
         </w:trPr>
@@ -3235,12 +3011,6 @@
         </w:tc>
       </w:tr>
       <w:tr>
-        <w:tblPrEx>
-          <w:tblCellMar>
-            <w:top w:w="0" w:type="dxa"/>
-            <w:bottom w:w="0" w:type="dxa"/>
-          </w:tblCellMar>
-        </w:tblPrEx>
         <w:trPr>
           <w:cantSplit/>
         </w:trPr>
@@ -3327,12 +3097,6 @@
         </w:tc>
       </w:tr>
       <w:tr>
-        <w:tblPrEx>
-          <w:tblCellMar>
-            <w:top w:w="0" w:type="dxa"/>
-            <w:bottom w:w="0" w:type="dxa"/>
-          </w:tblCellMar>
-        </w:tblPrEx>
         <w:trPr>
           <w:cantSplit/>
         </w:trPr>
@@ -3422,12 +3186,6 @@
         </w:tc>
       </w:tr>
       <w:tr>
-        <w:tblPrEx>
-          <w:tblCellMar>
-            <w:top w:w="0" w:type="dxa"/>
-            <w:bottom w:w="0" w:type="dxa"/>
-          </w:tblCellMar>
-        </w:tblPrEx>
         <w:trPr>
           <w:cantSplit/>
         </w:trPr>
@@ -3514,12 +3272,6 @@
         </w:tc>
       </w:tr>
       <w:tr>
-        <w:tblPrEx>
-          <w:tblCellMar>
-            <w:top w:w="0" w:type="dxa"/>
-            <w:bottom w:w="0" w:type="dxa"/>
-          </w:tblCellMar>
-        </w:tblPrEx>
         <w:trPr>
           <w:cantSplit/>
         </w:trPr>
@@ -3609,12 +3361,6 @@
         </w:tc>
       </w:tr>
       <w:tr>
-        <w:tblPrEx>
-          <w:tblCellMar>
-            <w:top w:w="0" w:type="dxa"/>
-            <w:bottom w:w="0" w:type="dxa"/>
-          </w:tblCellMar>
-        </w:tblPrEx>
         <w:trPr>
           <w:cantSplit/>
         </w:trPr>
@@ -3718,19 +3464,7 @@
         <w:rPr>
           <w:rFonts w:cs="Calibri"/>
         </w:rPr>
-        <w:t>Primary keys are surrogate integer IDs (AUTO_INCREMENT); the two link tables (product_supplier, sale_lot) use composite primary keys. Foreign keys enforce referential integrity with ON DELETE RESTRICT for business history (products in bills or lots, suppli</w:t>
-      </w:r>
-      <w:r>
-        <w:rPr>
-          <w:rFonts w:cs="Calibri"/>
-        </w:rPr>
-        <w:t>ers with purchases), CASCADE for rows that cannot exist without their parent (bill lines, payments, product–supplier links) and SET NULL where history must survive (a deleted customer or category). Money uses DECIMAL, dates use DATE/DATETIME, roles use ENU</w:t>
-      </w:r>
-      <w:r>
-        <w:rPr>
-          <w:rFonts w:cs="Calibri"/>
-        </w:rPr>
-        <w:t>M, and CHECK constraints keep quantities positive and prices non-negative.</w:t>
+        <w:t>Primary keys are surrogate integer IDs (AUTO_INCREMENT); the two link tables (product_supplier, sale_lot) use composite primary keys. Foreign keys enforce referential integrity with ON DELETE RESTRICT for business history (products in bills or lots, suppliers with purchases), CASCADE for rows that cannot exist without their parent (bill lines, payments, product–supplier links) and SET NULL where history must survive (a deleted customer or category). Money uses DECIMAL, dates use DATE/DATETIME, roles use ENUM, and CHECK constraints keep quantities positive and prices non-negative.</w:t>
       </w:r>
     </w:p>
     <w:p>
@@ -3741,26 +3475,14 @@
         <w:rPr>
           <w:rFonts w:cs="Calibri"/>
         </w:rPr>
-        <w:t>Design principle: every table stores only independent facts. Anything that can be computed — bill totals, amount paid, due, stock, average cost, nearest expiry, cost of goods sold —</w:t>
-      </w:r>
-      <w:r>
-        <w:rPr>
-          <w:rFonts w:cs="Calibri"/>
-        </w:rPr>
-        <w:t xml:space="preserve"> is derived at read time and never stored, so it can never become inconsistent. The schema is in 3NF: every non-key </w:t>
+        <w:t xml:space="preserve">Design principle: every table stores only independent facts. Anything that can be computed — bill totals, amount paid, due, stock, average cost, nearest expiry, cost of goods sold — is derived at read time and never stored, so it can never become inconsistent. The schema is in 3NF: every non-key </w:t>
       </w:r>
       <w:r>
         <w:rPr>
           <w:rFonts w:cs="Calibri"/>
         </w:rPr>
         <w:lastRenderedPageBreak/>
-        <w:t>attribute depends only on its own table's key, order lines live in detail tables, and there are no repeating groups or transitive dependenci</w:t>
-      </w:r>
-      <w:r>
-        <w:rPr>
-          <w:rFonts w:cs="Calibri"/>
-        </w:rPr>
-        <w:t>es.</w:t>
+        <w:t>attribute depends only on its own table's key, order lines live in detail tables, and there are no repeating groups or transitive dependencies.</w:t>
       </w:r>
     </w:p>
     <w:tbl>
@@ -3787,12 +3509,6 @@
         <w:gridCol w:w="2805"/>
       </w:tblGrid>
       <w:tr>
-        <w:tblPrEx>
-          <w:tblCellMar>
-            <w:top w:w="0" w:type="dxa"/>
-            <w:bottom w:w="0" w:type="dxa"/>
-          </w:tblCellMar>
-        </w:tblPrEx>
         <w:trPr>
           <w:cantSplit/>
           <w:tblHeader/>
@@ -3923,12 +3639,6 @@
         </w:tc>
       </w:tr>
       <w:tr>
-        <w:tblPrEx>
-          <w:tblCellMar>
-            <w:top w:w="0" w:type="dxa"/>
-            <w:bottom w:w="0" w:type="dxa"/>
-          </w:tblCellMar>
-        </w:tblPrEx>
         <w:trPr>
           <w:cantSplit/>
         </w:trPr>
@@ -4044,12 +3754,6 @@
         </w:tc>
       </w:tr>
       <w:tr>
-        <w:tblPrEx>
-          <w:tblCellMar>
-            <w:top w:w="0" w:type="dxa"/>
-            <w:bottom w:w="0" w:type="dxa"/>
-          </w:tblCellMar>
-        </w:tblPrEx>
         <w:trPr>
           <w:cantSplit/>
         </w:trPr>
@@ -4169,12 +3873,6 @@
         </w:tc>
       </w:tr>
       <w:tr>
-        <w:tblPrEx>
-          <w:tblCellMar>
-            <w:top w:w="0" w:type="dxa"/>
-            <w:bottom w:w="0" w:type="dxa"/>
-          </w:tblCellMar>
-        </w:tblPrEx>
         <w:trPr>
           <w:cantSplit/>
         </w:trPr>
@@ -4290,12 +3988,6 @@
         </w:tc>
       </w:tr>
       <w:tr>
-        <w:tblPrEx>
-          <w:tblCellMar>
-            <w:top w:w="0" w:type="dxa"/>
-            <w:bottom w:w="0" w:type="dxa"/>
-          </w:tblCellMar>
-        </w:tblPrEx>
         <w:trPr>
           <w:cantSplit/>
         </w:trPr>
@@ -4415,12 +4107,6 @@
         </w:tc>
       </w:tr>
       <w:tr>
-        <w:tblPrEx>
-          <w:tblCellMar>
-            <w:top w:w="0" w:type="dxa"/>
-            <w:bottom w:w="0" w:type="dxa"/>
-          </w:tblCellMar>
-        </w:tblPrEx>
         <w:trPr>
           <w:cantSplit/>
         </w:trPr>
@@ -4536,12 +4222,6 @@
         </w:tc>
       </w:tr>
       <w:tr>
-        <w:tblPrEx>
-          <w:tblCellMar>
-            <w:top w:w="0" w:type="dxa"/>
-            <w:bottom w:w="0" w:type="dxa"/>
-          </w:tblCellMar>
-        </w:tblPrEx>
         <w:trPr>
           <w:cantSplit/>
         </w:trPr>
@@ -4661,12 +4341,6 @@
         </w:tc>
       </w:tr>
       <w:tr>
-        <w:tblPrEx>
-          <w:tblCellMar>
-            <w:top w:w="0" w:type="dxa"/>
-            <w:bottom w:w="0" w:type="dxa"/>
-          </w:tblCellMar>
-        </w:tblPrEx>
         <w:trPr>
           <w:cantSplit/>
         </w:trPr>
@@ -4782,12 +4456,6 @@
         </w:tc>
       </w:tr>
       <w:tr>
-        <w:tblPrEx>
-          <w:tblCellMar>
-            <w:top w:w="0" w:type="dxa"/>
-            <w:bottom w:w="0" w:type="dxa"/>
-          </w:tblCellMar>
-        </w:tblPrEx>
         <w:trPr>
           <w:cantSplit/>
         </w:trPr>
@@ -4907,12 +4575,6 @@
         </w:tc>
       </w:tr>
       <w:tr>
-        <w:tblPrEx>
-          <w:tblCellMar>
-            <w:top w:w="0" w:type="dxa"/>
-            <w:bottom w:w="0" w:type="dxa"/>
-          </w:tblCellMar>
-        </w:tblPrEx>
         <w:trPr>
           <w:cantSplit/>
         </w:trPr>
@@ -5028,12 +4690,6 @@
         </w:tc>
       </w:tr>
       <w:tr>
-        <w:tblPrEx>
-          <w:tblCellMar>
-            <w:top w:w="0" w:type="dxa"/>
-            <w:bottom w:w="0" w:type="dxa"/>
-          </w:tblCellMar>
-        </w:tblPrEx>
         <w:trPr>
           <w:cantSplit/>
         </w:trPr>
@@ -5153,12 +4809,6 @@
         </w:tc>
       </w:tr>
       <w:tr>
-        <w:tblPrEx>
-          <w:tblCellMar>
-            <w:top w:w="0" w:type="dxa"/>
-            <w:bottom w:w="0" w:type="dxa"/>
-          </w:tblCellMar>
-        </w:tblPrEx>
         <w:trPr>
           <w:cantSplit/>
         </w:trPr>
@@ -5274,12 +4924,6 @@
         </w:tc>
       </w:tr>
       <w:tr>
-        <w:tblPrEx>
-          <w:tblCellMar>
-            <w:top w:w="0" w:type="dxa"/>
-            <w:bottom w:w="0" w:type="dxa"/>
-          </w:tblCellMar>
-        </w:tblPrEx>
         <w:trPr>
           <w:cantSplit/>
         </w:trPr>
@@ -5399,12 +5043,6 @@
         </w:tc>
       </w:tr>
       <w:tr>
-        <w:tblPrEx>
-          <w:tblCellMar>
-            <w:top w:w="0" w:type="dxa"/>
-            <w:bottom w:w="0" w:type="dxa"/>
-          </w:tblCellMar>
-        </w:tblPrEx>
         <w:trPr>
           <w:cantSplit/>
         </w:trPr>
@@ -5520,12 +5158,6 @@
         </w:tc>
       </w:tr>
       <w:tr>
-        <w:tblPrEx>
-          <w:tblCellMar>
-            <w:top w:w="0" w:type="dxa"/>
-            <w:bottom w:w="0" w:type="dxa"/>
-          </w:tblCellMar>
-        </w:tblPrEx>
         <w:trPr>
           <w:cantSplit/>
         </w:trPr>
@@ -5697,12 +5329,6 @@
         <w:gridCol w:w="3449"/>
       </w:tblGrid>
       <w:tr>
-        <w:tblPrEx>
-          <w:tblCellMar>
-            <w:top w:w="0" w:type="dxa"/>
-            <w:bottom w:w="0" w:type="dxa"/>
-          </w:tblCellMar>
-        </w:tblPrEx>
         <w:trPr>
           <w:cantSplit/>
           <w:tblHeader/>
@@ -5833,12 +5459,6 @@
         </w:tc>
       </w:tr>
       <w:tr>
-        <w:tblPrEx>
-          <w:tblCellMar>
-            <w:top w:w="0" w:type="dxa"/>
-            <w:bottom w:w="0" w:type="dxa"/>
-          </w:tblCellMar>
-        </w:tblPrEx>
         <w:trPr>
           <w:cantSplit/>
         </w:trPr>
@@ -5952,12 +5572,6 @@
         </w:tc>
       </w:tr>
       <w:tr>
-        <w:tblPrEx>
-          <w:tblCellMar>
-            <w:top w:w="0" w:type="dxa"/>
-            <w:bottom w:w="0" w:type="dxa"/>
-          </w:tblCellMar>
-        </w:tblPrEx>
         <w:trPr>
           <w:cantSplit/>
         </w:trPr>
@@ -6062,12 +5676,6 @@
         </w:tc>
       </w:tr>
       <w:tr>
-        <w:tblPrEx>
-          <w:tblCellMar>
-            <w:top w:w="0" w:type="dxa"/>
-            <w:bottom w:w="0" w:type="dxa"/>
-          </w:tblCellMar>
-        </w:tblPrEx>
         <w:trPr>
           <w:cantSplit/>
         </w:trPr>
@@ -6172,12 +5780,6 @@
         </w:tc>
       </w:tr>
       <w:tr>
-        <w:tblPrEx>
-          <w:tblCellMar>
-            <w:top w:w="0" w:type="dxa"/>
-            <w:bottom w:w="0" w:type="dxa"/>
-          </w:tblCellMar>
-        </w:tblPrEx>
         <w:trPr>
           <w:cantSplit/>
         </w:trPr>
@@ -6282,12 +5884,6 @@
         </w:tc>
       </w:tr>
       <w:tr>
-        <w:tblPrEx>
-          <w:tblCellMar>
-            <w:top w:w="0" w:type="dxa"/>
-            <w:bottom w:w="0" w:type="dxa"/>
-          </w:tblCellMar>
-        </w:tblPrEx>
         <w:trPr>
           <w:cantSplit/>
         </w:trPr>
@@ -6392,12 +5988,6 @@
         </w:tc>
       </w:tr>
       <w:tr>
-        <w:tblPrEx>
-          <w:tblCellMar>
-            <w:top w:w="0" w:type="dxa"/>
-            <w:bottom w:w="0" w:type="dxa"/>
-          </w:tblCellMar>
-        </w:tblPrEx>
         <w:trPr>
           <w:cantSplit/>
         </w:trPr>
@@ -6540,12 +6130,6 @@
         <w:gridCol w:w="3726"/>
       </w:tblGrid>
       <w:tr>
-        <w:tblPrEx>
-          <w:tblCellMar>
-            <w:top w:w="0" w:type="dxa"/>
-            <w:bottom w:w="0" w:type="dxa"/>
-          </w:tblCellMar>
-        </w:tblPrEx>
         <w:trPr>
           <w:cantSplit/>
           <w:tblHeader/>
@@ -6676,12 +6260,6 @@
         </w:tc>
       </w:tr>
       <w:tr>
-        <w:tblPrEx>
-          <w:tblCellMar>
-            <w:top w:w="0" w:type="dxa"/>
-            <w:bottom w:w="0" w:type="dxa"/>
-          </w:tblCellMar>
-        </w:tblPrEx>
         <w:trPr>
           <w:cantSplit/>
         </w:trPr>
@@ -6795,12 +6373,6 @@
         </w:tc>
       </w:tr>
       <w:tr>
-        <w:tblPrEx>
-          <w:tblCellMar>
-            <w:top w:w="0" w:type="dxa"/>
-            <w:bottom w:w="0" w:type="dxa"/>
-          </w:tblCellMar>
-        </w:tblPrEx>
         <w:trPr>
           <w:cantSplit/>
         </w:trPr>
@@ -6905,12 +6477,6 @@
         </w:tc>
       </w:tr>
       <w:tr>
-        <w:tblPrEx>
-          <w:tblCellMar>
-            <w:top w:w="0" w:type="dxa"/>
-            <w:bottom w:w="0" w:type="dxa"/>
-          </w:tblCellMar>
-        </w:tblPrEx>
         <w:trPr>
           <w:cantSplit/>
         </w:trPr>
@@ -7016,12 +6582,6 @@
         </w:tc>
       </w:tr>
       <w:tr>
-        <w:tblPrEx>
-          <w:tblCellMar>
-            <w:top w:w="0" w:type="dxa"/>
-            <w:bottom w:w="0" w:type="dxa"/>
-          </w:tblCellMar>
-        </w:tblPrEx>
         <w:trPr>
           <w:cantSplit/>
         </w:trPr>
@@ -7164,12 +6724,6 @@
         <w:gridCol w:w="3726"/>
       </w:tblGrid>
       <w:tr>
-        <w:tblPrEx>
-          <w:tblCellMar>
-            <w:top w:w="0" w:type="dxa"/>
-            <w:bottom w:w="0" w:type="dxa"/>
-          </w:tblCellMar>
-        </w:tblPrEx>
         <w:trPr>
           <w:cantSplit/>
           <w:tblHeader/>
@@ -7300,12 +6854,6 @@
         </w:tc>
       </w:tr>
       <w:tr>
-        <w:tblPrEx>
-          <w:tblCellMar>
-            <w:top w:w="0" w:type="dxa"/>
-            <w:bottom w:w="0" w:type="dxa"/>
-          </w:tblCellMar>
-        </w:tblPrEx>
         <w:trPr>
           <w:cantSplit/>
         </w:trPr>
@@ -7419,12 +6967,6 @@
         </w:tc>
       </w:tr>
       <w:tr>
-        <w:tblPrEx>
-          <w:tblCellMar>
-            <w:top w:w="0" w:type="dxa"/>
-            <w:bottom w:w="0" w:type="dxa"/>
-          </w:tblCellMar>
-        </w:tblPrEx>
         <w:trPr>
           <w:cantSplit/>
         </w:trPr>
@@ -7529,12 +7071,6 @@
         </w:tc>
       </w:tr>
       <w:tr>
-        <w:tblPrEx>
-          <w:tblCellMar>
-            <w:top w:w="0" w:type="dxa"/>
-            <w:bottom w:w="0" w:type="dxa"/>
-          </w:tblCellMar>
-        </w:tblPrEx>
         <w:trPr>
           <w:cantSplit/>
         </w:trPr>
@@ -7639,12 +7175,6 @@
         </w:tc>
       </w:tr>
       <w:tr>
-        <w:tblPrEx>
-          <w:tblCellMar>
-            <w:top w:w="0" w:type="dxa"/>
-            <w:bottom w:w="0" w:type="dxa"/>
-          </w:tblCellMar>
-        </w:tblPrEx>
         <w:trPr>
           <w:cantSplit/>
         </w:trPr>
@@ -7749,12 +7279,6 @@
         </w:tc>
       </w:tr>
       <w:tr>
-        <w:tblPrEx>
-          <w:tblCellMar>
-            <w:top w:w="0" w:type="dxa"/>
-            <w:bottom w:w="0" w:type="dxa"/>
-          </w:tblCellMar>
-        </w:tblPrEx>
         <w:trPr>
           <w:cantSplit/>
         </w:trPr>
@@ -7859,12 +7383,6 @@
         </w:tc>
       </w:tr>
       <w:tr>
-        <w:tblPrEx>
-          <w:tblCellMar>
-            <w:top w:w="0" w:type="dxa"/>
-            <w:bottom w:w="0" w:type="dxa"/>
-          </w:tblCellMar>
-        </w:tblPrEx>
         <w:trPr>
           <w:cantSplit/>
         </w:trPr>
@@ -7969,12 +7487,6 @@
         </w:tc>
       </w:tr>
       <w:tr>
-        <w:tblPrEx>
-          <w:tblCellMar>
-            <w:top w:w="0" w:type="dxa"/>
-            <w:bottom w:w="0" w:type="dxa"/>
-          </w:tblCellMar>
-        </w:tblPrEx>
         <w:trPr>
           <w:cantSplit/>
         </w:trPr>
@@ -8117,12 +7629,6 @@
         <w:gridCol w:w="3726"/>
       </w:tblGrid>
       <w:tr>
-        <w:tblPrEx>
-          <w:tblCellMar>
-            <w:top w:w="0" w:type="dxa"/>
-            <w:bottom w:w="0" w:type="dxa"/>
-          </w:tblCellMar>
-        </w:tblPrEx>
         <w:trPr>
           <w:cantSplit/>
           <w:tblHeader/>
@@ -8253,12 +7759,6 @@
         </w:tc>
       </w:tr>
       <w:tr>
-        <w:tblPrEx>
-          <w:tblCellMar>
-            <w:top w:w="0" w:type="dxa"/>
-            <w:bottom w:w="0" w:type="dxa"/>
-          </w:tblCellMar>
-        </w:tblPrEx>
         <w:trPr>
           <w:cantSplit/>
         </w:trPr>
@@ -8372,12 +7872,6 @@
         </w:tc>
       </w:tr>
       <w:tr>
-        <w:tblPrEx>
-          <w:tblCellMar>
-            <w:top w:w="0" w:type="dxa"/>
-            <w:bottom w:w="0" w:type="dxa"/>
-          </w:tblCellMar>
-        </w:tblPrEx>
         <w:trPr>
           <w:cantSplit/>
         </w:trPr>
@@ -8482,12 +7976,6 @@
         </w:tc>
       </w:tr>
       <w:tr>
-        <w:tblPrEx>
-          <w:tblCellMar>
-            <w:top w:w="0" w:type="dxa"/>
-            <w:bottom w:w="0" w:type="dxa"/>
-          </w:tblCellMar>
-        </w:tblPrEx>
         <w:trPr>
           <w:cantSplit/>
         </w:trPr>
@@ -8592,12 +8080,6 @@
         </w:tc>
       </w:tr>
       <w:tr>
-        <w:tblPrEx>
-          <w:tblCellMar>
-            <w:top w:w="0" w:type="dxa"/>
-            <w:bottom w:w="0" w:type="dxa"/>
-          </w:tblCellMar>
-        </w:tblPrEx>
         <w:trPr>
           <w:cantSplit/>
         </w:trPr>
@@ -8702,12 +8184,6 @@
         </w:tc>
       </w:tr>
       <w:tr>
-        <w:tblPrEx>
-          <w:tblCellMar>
-            <w:top w:w="0" w:type="dxa"/>
-            <w:bottom w:w="0" w:type="dxa"/>
-          </w:tblCellMar>
-        </w:tblPrEx>
         <w:trPr>
           <w:cantSplit/>
         </w:trPr>
@@ -8812,12 +8288,6 @@
         </w:tc>
       </w:tr>
       <w:tr>
-        <w:tblPrEx>
-          <w:tblCellMar>
-            <w:top w:w="0" w:type="dxa"/>
-            <w:bottom w:w="0" w:type="dxa"/>
-          </w:tblCellMar>
-        </w:tblPrEx>
         <w:trPr>
           <w:cantSplit/>
         </w:trPr>
@@ -8922,12 +8392,6 @@
         </w:tc>
       </w:tr>
       <w:tr>
-        <w:tblPrEx>
-          <w:tblCellMar>
-            <w:top w:w="0" w:type="dxa"/>
-            <w:bottom w:w="0" w:type="dxa"/>
-          </w:tblCellMar>
-        </w:tblPrEx>
         <w:trPr>
           <w:cantSplit/>
         </w:trPr>
@@ -9070,12 +8534,6 @@
         <w:gridCol w:w="3726"/>
       </w:tblGrid>
       <w:tr>
-        <w:tblPrEx>
-          <w:tblCellMar>
-            <w:top w:w="0" w:type="dxa"/>
-            <w:bottom w:w="0" w:type="dxa"/>
-          </w:tblCellMar>
-        </w:tblPrEx>
         <w:trPr>
           <w:cantSplit/>
           <w:tblHeader/>
@@ -9206,12 +8664,6 @@
         </w:tc>
       </w:tr>
       <w:tr>
-        <w:tblPrEx>
-          <w:tblCellMar>
-            <w:top w:w="0" w:type="dxa"/>
-            <w:bottom w:w="0" w:type="dxa"/>
-          </w:tblCellMar>
-        </w:tblPrEx>
         <w:trPr>
           <w:cantSplit/>
         </w:trPr>
@@ -9325,12 +8777,6 @@
         </w:tc>
       </w:tr>
       <w:tr>
-        <w:tblPrEx>
-          <w:tblCellMar>
-            <w:top w:w="0" w:type="dxa"/>
-            <w:bottom w:w="0" w:type="dxa"/>
-          </w:tblCellMar>
-        </w:tblPrEx>
         <w:trPr>
           <w:cantSplit/>
         </w:trPr>
@@ -9435,12 +8881,6 @@
         </w:tc>
       </w:tr>
       <w:tr>
-        <w:tblPrEx>
-          <w:tblCellMar>
-            <w:top w:w="0" w:type="dxa"/>
-            <w:bottom w:w="0" w:type="dxa"/>
-          </w:tblCellMar>
-        </w:tblPrEx>
         <w:trPr>
           <w:cantSplit/>
         </w:trPr>
@@ -9554,12 +8994,6 @@
         </w:tc>
       </w:tr>
       <w:tr>
-        <w:tblPrEx>
-          <w:tblCellMar>
-            <w:top w:w="0" w:type="dxa"/>
-            <w:bottom w:w="0" w:type="dxa"/>
-          </w:tblCellMar>
-        </w:tblPrEx>
         <w:trPr>
           <w:cantSplit/>
         </w:trPr>
@@ -9664,12 +9098,6 @@
         </w:tc>
       </w:tr>
       <w:tr>
-        <w:tblPrEx>
-          <w:tblCellMar>
-            <w:top w:w="0" w:type="dxa"/>
-            <w:bottom w:w="0" w:type="dxa"/>
-          </w:tblCellMar>
-        </w:tblPrEx>
         <w:trPr>
           <w:cantSplit/>
         </w:trPr>
@@ -9774,12 +9202,6 @@
         </w:tc>
       </w:tr>
       <w:tr>
-        <w:tblPrEx>
-          <w:tblCellMar>
-            <w:top w:w="0" w:type="dxa"/>
-            <w:bottom w:w="0" w:type="dxa"/>
-          </w:tblCellMar>
-        </w:tblPrEx>
         <w:trPr>
           <w:cantSplit/>
         </w:trPr>
@@ -9884,12 +9306,6 @@
         </w:tc>
       </w:tr>
       <w:tr>
-        <w:tblPrEx>
-          <w:tblCellMar>
-            <w:top w:w="0" w:type="dxa"/>
-            <w:bottom w:w="0" w:type="dxa"/>
-          </w:tblCellMar>
-        </w:tblPrEx>
         <w:trPr>
           <w:cantSplit/>
         </w:trPr>
@@ -10032,12 +9448,6 @@
         <w:gridCol w:w="3726"/>
       </w:tblGrid>
       <w:tr>
-        <w:tblPrEx>
-          <w:tblCellMar>
-            <w:top w:w="0" w:type="dxa"/>
-            <w:bottom w:w="0" w:type="dxa"/>
-          </w:tblCellMar>
-        </w:tblPrEx>
         <w:trPr>
           <w:cantSplit/>
           <w:tblHeader/>
@@ -10168,12 +9578,6 @@
         </w:tc>
       </w:tr>
       <w:tr>
-        <w:tblPrEx>
-          <w:tblCellMar>
-            <w:top w:w="0" w:type="dxa"/>
-            <w:bottom w:w="0" w:type="dxa"/>
-          </w:tblCellMar>
-        </w:tblPrEx>
         <w:trPr>
           <w:cantSplit/>
         </w:trPr>
@@ -10287,12 +9691,6 @@
         </w:tc>
       </w:tr>
       <w:tr>
-        <w:tblPrEx>
-          <w:tblCellMar>
-            <w:top w:w="0" w:type="dxa"/>
-            <w:bottom w:w="0" w:type="dxa"/>
-          </w:tblCellMar>
-        </w:tblPrEx>
         <w:trPr>
           <w:cantSplit/>
         </w:trPr>
@@ -10445,12 +9843,6 @@
         <w:gridCol w:w="3726"/>
       </w:tblGrid>
       <w:tr>
-        <w:tblPrEx>
-          <w:tblCellMar>
-            <w:top w:w="0" w:type="dxa"/>
-            <w:bottom w:w="0" w:type="dxa"/>
-          </w:tblCellMar>
-        </w:tblPrEx>
         <w:trPr>
           <w:cantSplit/>
           <w:tblHeader/>
@@ -10581,12 +9973,6 @@
         </w:tc>
       </w:tr>
       <w:tr>
-        <w:tblPrEx>
-          <w:tblCellMar>
-            <w:top w:w="0" w:type="dxa"/>
-            <w:bottom w:w="0" w:type="dxa"/>
-          </w:tblCellMar>
-        </w:tblPrEx>
         <w:trPr>
           <w:cantSplit/>
         </w:trPr>
@@ -10700,12 +10086,6 @@
         </w:tc>
       </w:tr>
       <w:tr>
-        <w:tblPrEx>
-          <w:tblCellMar>
-            <w:top w:w="0" w:type="dxa"/>
-            <w:bottom w:w="0" w:type="dxa"/>
-          </w:tblCellMar>
-        </w:tblPrEx>
         <w:trPr>
           <w:cantSplit/>
         </w:trPr>
@@ -10819,12 +10199,6 @@
         </w:tc>
       </w:tr>
       <w:tr>
-        <w:tblPrEx>
-          <w:tblCellMar>
-            <w:top w:w="0" w:type="dxa"/>
-            <w:bottom w:w="0" w:type="dxa"/>
-          </w:tblCellMar>
-        </w:tblPrEx>
         <w:trPr>
           <w:cantSplit/>
         </w:trPr>
@@ -10967,12 +10341,6 @@
         <w:gridCol w:w="3726"/>
       </w:tblGrid>
       <w:tr>
-        <w:tblPrEx>
-          <w:tblCellMar>
-            <w:top w:w="0" w:type="dxa"/>
-            <w:bottom w:w="0" w:type="dxa"/>
-          </w:tblCellMar>
-        </w:tblPrEx>
         <w:trPr>
           <w:cantSplit/>
           <w:tblHeader/>
@@ -11103,12 +10471,6 @@
         </w:tc>
       </w:tr>
       <w:tr>
-        <w:tblPrEx>
-          <w:tblCellMar>
-            <w:top w:w="0" w:type="dxa"/>
-            <w:bottom w:w="0" w:type="dxa"/>
-          </w:tblCellMar>
-        </w:tblPrEx>
         <w:trPr>
           <w:cantSplit/>
         </w:trPr>
@@ -11222,12 +10584,6 @@
         </w:tc>
       </w:tr>
       <w:tr>
-        <w:tblPrEx>
-          <w:tblCellMar>
-            <w:top w:w="0" w:type="dxa"/>
-            <w:bottom w:w="0" w:type="dxa"/>
-          </w:tblCellMar>
-        </w:tblPrEx>
         <w:trPr>
           <w:cantSplit/>
         </w:trPr>
@@ -11341,12 +10697,6 @@
         </w:tc>
       </w:tr>
       <w:tr>
-        <w:tblPrEx>
-          <w:tblCellMar>
-            <w:top w:w="0" w:type="dxa"/>
-            <w:bottom w:w="0" w:type="dxa"/>
-          </w:tblCellMar>
-        </w:tblPrEx>
         <w:trPr>
           <w:cantSplit/>
         </w:trPr>
@@ -11460,12 +10810,6 @@
         </w:tc>
       </w:tr>
       <w:tr>
-        <w:tblPrEx>
-          <w:tblCellMar>
-            <w:top w:w="0" w:type="dxa"/>
-            <w:bottom w:w="0" w:type="dxa"/>
-          </w:tblCellMar>
-        </w:tblPrEx>
         <w:trPr>
           <w:cantSplit/>
         </w:trPr>
@@ -11570,12 +10914,6 @@
         </w:tc>
       </w:tr>
       <w:tr>
-        <w:tblPrEx>
-          <w:tblCellMar>
-            <w:top w:w="0" w:type="dxa"/>
-            <w:bottom w:w="0" w:type="dxa"/>
-          </w:tblCellMar>
-        </w:tblPrEx>
         <w:trPr>
           <w:cantSplit/>
         </w:trPr>
@@ -11718,12 +11056,6 @@
         <w:gridCol w:w="3726"/>
       </w:tblGrid>
       <w:tr>
-        <w:tblPrEx>
-          <w:tblCellMar>
-            <w:top w:w="0" w:type="dxa"/>
-            <w:bottom w:w="0" w:type="dxa"/>
-          </w:tblCellMar>
-        </w:tblPrEx>
         <w:trPr>
           <w:cantSplit/>
           <w:tblHeader/>
@@ -11854,12 +11186,6 @@
         </w:tc>
       </w:tr>
       <w:tr>
-        <w:tblPrEx>
-          <w:tblCellMar>
-            <w:top w:w="0" w:type="dxa"/>
-            <w:bottom w:w="0" w:type="dxa"/>
-          </w:tblCellMar>
-        </w:tblPrEx>
         <w:trPr>
           <w:cantSplit/>
         </w:trPr>
@@ -11973,12 +11299,6 @@
         </w:tc>
       </w:tr>
       <w:tr>
-        <w:tblPrEx>
-          <w:tblCellMar>
-            <w:top w:w="0" w:type="dxa"/>
-            <w:bottom w:w="0" w:type="dxa"/>
-          </w:tblCellMar>
-        </w:tblPrEx>
         <w:trPr>
           <w:cantSplit/>
         </w:trPr>
@@ -12092,12 +11412,6 @@
         </w:tc>
       </w:tr>
       <w:tr>
-        <w:tblPrEx>
-          <w:tblCellMar>
-            <w:top w:w="0" w:type="dxa"/>
-            <w:bottom w:w="0" w:type="dxa"/>
-          </w:tblCellMar>
-        </w:tblPrEx>
         <w:trPr>
           <w:cantSplit/>
         </w:trPr>
@@ -12211,12 +11525,6 @@
         </w:tc>
       </w:tr>
       <w:tr>
-        <w:tblPrEx>
-          <w:tblCellMar>
-            <w:top w:w="0" w:type="dxa"/>
-            <w:bottom w:w="0" w:type="dxa"/>
-          </w:tblCellMar>
-        </w:tblPrEx>
         <w:trPr>
           <w:cantSplit/>
         </w:trPr>
@@ -12330,12 +11638,6 @@
         </w:tc>
       </w:tr>
       <w:tr>
-        <w:tblPrEx>
-          <w:tblCellMar>
-            <w:top w:w="0" w:type="dxa"/>
-            <w:bottom w:w="0" w:type="dxa"/>
-          </w:tblCellMar>
-        </w:tblPrEx>
         <w:trPr>
           <w:cantSplit/>
         </w:trPr>
@@ -12440,12 +11742,6 @@
         </w:tc>
       </w:tr>
       <w:tr>
-        <w:tblPrEx>
-          <w:tblCellMar>
-            <w:top w:w="0" w:type="dxa"/>
-            <w:bottom w:w="0" w:type="dxa"/>
-          </w:tblCellMar>
-        </w:tblPrEx>
         <w:trPr>
           <w:cantSplit/>
         </w:trPr>
@@ -12550,12 +11846,6 @@
         </w:tc>
       </w:tr>
       <w:tr>
-        <w:tblPrEx>
-          <w:tblCellMar>
-            <w:top w:w="0" w:type="dxa"/>
-            <w:bottom w:w="0" w:type="dxa"/>
-          </w:tblCellMar>
-        </w:tblPrEx>
         <w:trPr>
           <w:cantSplit/>
         </w:trPr>
@@ -12660,12 +11950,6 @@
         </w:tc>
       </w:tr>
       <w:tr>
-        <w:tblPrEx>
-          <w:tblCellMar>
-            <w:top w:w="0" w:type="dxa"/>
-            <w:bottom w:w="0" w:type="dxa"/>
-          </w:tblCellMar>
-        </w:tblPrEx>
         <w:trPr>
           <w:cantSplit/>
         </w:trPr>
@@ -12770,12 +12054,6 @@
         </w:tc>
       </w:tr>
       <w:tr>
-        <w:tblPrEx>
-          <w:tblCellMar>
-            <w:top w:w="0" w:type="dxa"/>
-            <w:bottom w:w="0" w:type="dxa"/>
-          </w:tblCellMar>
-        </w:tblPrEx>
         <w:trPr>
           <w:cantSplit/>
         </w:trPr>
@@ -12918,12 +12196,6 @@
         <w:gridCol w:w="3726"/>
       </w:tblGrid>
       <w:tr>
-        <w:tblPrEx>
-          <w:tblCellMar>
-            <w:top w:w="0" w:type="dxa"/>
-            <w:bottom w:w="0" w:type="dxa"/>
-          </w:tblCellMar>
-        </w:tblPrEx>
         <w:trPr>
           <w:cantSplit/>
           <w:tblHeader/>
@@ -13054,12 +12326,6 @@
         </w:tc>
       </w:tr>
       <w:tr>
-        <w:tblPrEx>
-          <w:tblCellMar>
-            <w:top w:w="0" w:type="dxa"/>
-            <w:bottom w:w="0" w:type="dxa"/>
-          </w:tblCellMar>
-        </w:tblPrEx>
         <w:trPr>
           <w:cantSplit/>
         </w:trPr>
@@ -13173,12 +12439,6 @@
         </w:tc>
       </w:tr>
       <w:tr>
-        <w:tblPrEx>
-          <w:tblCellMar>
-            <w:top w:w="0" w:type="dxa"/>
-            <w:bottom w:w="0" w:type="dxa"/>
-          </w:tblCellMar>
-        </w:tblPrEx>
         <w:trPr>
           <w:cantSplit/>
         </w:trPr>
@@ -13292,12 +12552,6 @@
         </w:tc>
       </w:tr>
       <w:tr>
-        <w:tblPrEx>
-          <w:tblCellMar>
-            <w:top w:w="0" w:type="dxa"/>
-            <w:bottom w:w="0" w:type="dxa"/>
-          </w:tblCellMar>
-        </w:tblPrEx>
         <w:trPr>
           <w:cantSplit/>
         </w:trPr>
@@ -13402,12 +12656,6 @@
         </w:tc>
       </w:tr>
       <w:tr>
-        <w:tblPrEx>
-          <w:tblCellMar>
-            <w:top w:w="0" w:type="dxa"/>
-            <w:bottom w:w="0" w:type="dxa"/>
-          </w:tblCellMar>
-        </w:tblPrEx>
         <w:trPr>
           <w:cantSplit/>
         </w:trPr>
@@ -13550,12 +12798,6 @@
         <w:gridCol w:w="3726"/>
       </w:tblGrid>
       <w:tr>
-        <w:tblPrEx>
-          <w:tblCellMar>
-            <w:top w:w="0" w:type="dxa"/>
-            <w:bottom w:w="0" w:type="dxa"/>
-          </w:tblCellMar>
-        </w:tblPrEx>
         <w:trPr>
           <w:cantSplit/>
           <w:tblHeader/>
@@ -13686,12 +12928,6 @@
         </w:tc>
       </w:tr>
       <w:tr>
-        <w:tblPrEx>
-          <w:tblCellMar>
-            <w:top w:w="0" w:type="dxa"/>
-            <w:bottom w:w="0" w:type="dxa"/>
-          </w:tblCellMar>
-        </w:tblPrEx>
         <w:trPr>
           <w:cantSplit/>
         </w:trPr>
@@ -13805,12 +13041,6 @@
         </w:tc>
       </w:tr>
       <w:tr>
-        <w:tblPrEx>
-          <w:tblCellMar>
-            <w:top w:w="0" w:type="dxa"/>
-            <w:bottom w:w="0" w:type="dxa"/>
-          </w:tblCellMar>
-        </w:tblPrEx>
         <w:trPr>
           <w:cantSplit/>
         </w:trPr>
@@ -13925,12 +13155,6 @@
         </w:tc>
       </w:tr>
       <w:tr>
-        <w:tblPrEx>
-          <w:tblCellMar>
-            <w:top w:w="0" w:type="dxa"/>
-            <w:bottom w:w="0" w:type="dxa"/>
-          </w:tblCellMar>
-        </w:tblPrEx>
         <w:trPr>
           <w:cantSplit/>
         </w:trPr>
@@ -14044,12 +13268,6 @@
         </w:tc>
       </w:tr>
       <w:tr>
-        <w:tblPrEx>
-          <w:tblCellMar>
-            <w:top w:w="0" w:type="dxa"/>
-            <w:bottom w:w="0" w:type="dxa"/>
-          </w:tblCellMar>
-        </w:tblPrEx>
         <w:trPr>
           <w:cantSplit/>
         </w:trPr>
@@ -14154,12 +13372,6 @@
         </w:tc>
       </w:tr>
       <w:tr>
-        <w:tblPrEx>
-          <w:tblCellMar>
-            <w:top w:w="0" w:type="dxa"/>
-            <w:bottom w:w="0" w:type="dxa"/>
-          </w:tblCellMar>
-        </w:tblPrEx>
         <w:trPr>
           <w:cantSplit/>
         </w:trPr>
@@ -14264,12 +13476,6 @@
         </w:tc>
       </w:tr>
       <w:tr>
-        <w:tblPrEx>
-          <w:tblCellMar>
-            <w:top w:w="0" w:type="dxa"/>
-            <w:bottom w:w="0" w:type="dxa"/>
-          </w:tblCellMar>
-        </w:tblPrEx>
         <w:trPr>
           <w:cantSplit/>
         </w:trPr>
@@ -14412,12 +13618,6 @@
         <w:gridCol w:w="3726"/>
       </w:tblGrid>
       <w:tr>
-        <w:tblPrEx>
-          <w:tblCellMar>
-            <w:top w:w="0" w:type="dxa"/>
-            <w:bottom w:w="0" w:type="dxa"/>
-          </w:tblCellMar>
-        </w:tblPrEx>
         <w:trPr>
           <w:cantSplit/>
           <w:tblHeader/>
@@ -14548,12 +13748,6 @@
         </w:tc>
       </w:tr>
       <w:tr>
-        <w:tblPrEx>
-          <w:tblCellMar>
-            <w:top w:w="0" w:type="dxa"/>
-            <w:bottom w:w="0" w:type="dxa"/>
-          </w:tblCellMar>
-        </w:tblPrEx>
         <w:trPr>
           <w:cantSplit/>
         </w:trPr>
@@ -14667,12 +13861,6 @@
         </w:tc>
       </w:tr>
       <w:tr>
-        <w:tblPrEx>
-          <w:tblCellMar>
-            <w:top w:w="0" w:type="dxa"/>
-            <w:bottom w:w="0" w:type="dxa"/>
-          </w:tblCellMar>
-        </w:tblPrEx>
         <w:trPr>
           <w:cantSplit/>
         </w:trPr>
@@ -14786,12 +13974,6 @@
         </w:tc>
       </w:tr>
       <w:tr>
-        <w:tblPrEx>
-          <w:tblCellMar>
-            <w:top w:w="0" w:type="dxa"/>
-            <w:bottom w:w="0" w:type="dxa"/>
-          </w:tblCellMar>
-        </w:tblPrEx>
         <w:trPr>
           <w:cantSplit/>
         </w:trPr>
@@ -14934,12 +14116,6 @@
         <w:gridCol w:w="3726"/>
       </w:tblGrid>
       <w:tr>
-        <w:tblPrEx>
-          <w:tblCellMar>
-            <w:top w:w="0" w:type="dxa"/>
-            <w:bottom w:w="0" w:type="dxa"/>
-          </w:tblCellMar>
-        </w:tblPrEx>
         <w:trPr>
           <w:cantSplit/>
           <w:tblHeader/>
@@ -15070,12 +14246,6 @@
         </w:tc>
       </w:tr>
       <w:tr>
-        <w:tblPrEx>
-          <w:tblCellMar>
-            <w:top w:w="0" w:type="dxa"/>
-            <w:bottom w:w="0" w:type="dxa"/>
-          </w:tblCellMar>
-        </w:tblPrEx>
         <w:trPr>
           <w:cantSplit/>
         </w:trPr>
@@ -15189,12 +14359,6 @@
         </w:tc>
       </w:tr>
       <w:tr>
-        <w:tblPrEx>
-          <w:tblCellMar>
-            <w:top w:w="0" w:type="dxa"/>
-            <w:bottom w:w="0" w:type="dxa"/>
-          </w:tblCellMar>
-        </w:tblPrEx>
         <w:trPr>
           <w:cantSplit/>
         </w:trPr>
@@ -15308,12 +14472,6 @@
         </w:tc>
       </w:tr>
       <w:tr>
-        <w:tblPrEx>
-          <w:tblCellMar>
-            <w:top w:w="0" w:type="dxa"/>
-            <w:bottom w:w="0" w:type="dxa"/>
-          </w:tblCellMar>
-        </w:tblPrEx>
         <w:trPr>
           <w:cantSplit/>
         </w:trPr>
@@ -15418,12 +14576,6 @@
         </w:tc>
       </w:tr>
       <w:tr>
-        <w:tblPrEx>
-          <w:tblCellMar>
-            <w:top w:w="0" w:type="dxa"/>
-            <w:bottom w:w="0" w:type="dxa"/>
-          </w:tblCellMar>
-        </w:tblPrEx>
         <w:trPr>
           <w:cantSplit/>
         </w:trPr>
@@ -15566,12 +14718,6 @@
         <w:gridCol w:w="3726"/>
       </w:tblGrid>
       <w:tr>
-        <w:tblPrEx>
-          <w:tblCellMar>
-            <w:top w:w="0" w:type="dxa"/>
-            <w:bottom w:w="0" w:type="dxa"/>
-          </w:tblCellMar>
-        </w:tblPrEx>
         <w:trPr>
           <w:cantSplit/>
           <w:tblHeader/>
@@ -15702,12 +14848,6 @@
         </w:tc>
       </w:tr>
       <w:tr>
-        <w:tblPrEx>
-          <w:tblCellMar>
-            <w:top w:w="0" w:type="dxa"/>
-            <w:bottom w:w="0" w:type="dxa"/>
-          </w:tblCellMar>
-        </w:tblPrEx>
         <w:trPr>
           <w:cantSplit/>
         </w:trPr>
@@ -15821,12 +14961,6 @@
         </w:tc>
       </w:tr>
       <w:tr>
-        <w:tblPrEx>
-          <w:tblCellMar>
-            <w:top w:w="0" w:type="dxa"/>
-            <w:bottom w:w="0" w:type="dxa"/>
-          </w:tblCellMar>
-        </w:tblPrEx>
         <w:trPr>
           <w:cantSplit/>
         </w:trPr>
@@ -15931,12 +15065,6 @@
         </w:tc>
       </w:tr>
       <w:tr>
-        <w:tblPrEx>
-          <w:tblCellMar>
-            <w:top w:w="0" w:type="dxa"/>
-            <w:bottom w:w="0" w:type="dxa"/>
-          </w:tblCellMar>
-        </w:tblPrEx>
         <w:trPr>
           <w:cantSplit/>
         </w:trPr>
@@ -16041,12 +15169,6 @@
         </w:tc>
       </w:tr>
       <w:tr>
-        <w:tblPrEx>
-          <w:tblCellMar>
-            <w:top w:w="0" w:type="dxa"/>
-            <w:bottom w:w="0" w:type="dxa"/>
-          </w:tblCellMar>
-        </w:tblPrEx>
         <w:trPr>
           <w:cantSplit/>
         </w:trPr>
@@ -16151,12 +15273,6 @@
         </w:tc>
       </w:tr>
       <w:tr>
-        <w:tblPrEx>
-          <w:tblCellMar>
-            <w:top w:w="0" w:type="dxa"/>
-            <w:bottom w:w="0" w:type="dxa"/>
-          </w:tblCellMar>
-        </w:tblPrEx>
         <w:trPr>
           <w:cantSplit/>
         </w:trPr>
@@ -16261,12 +15377,6 @@
         </w:tc>
       </w:tr>
       <w:tr>
-        <w:tblPrEx>
-          <w:tblCellMar>
-            <w:top w:w="0" w:type="dxa"/>
-            <w:bottom w:w="0" w:type="dxa"/>
-          </w:tblCellMar>
-        </w:tblPrEx>
         <w:trPr>
           <w:cantSplit/>
         </w:trPr>
@@ -16408,12 +15518,6 @@
         <w:gridCol w:w="4626"/>
       </w:tblGrid>
       <w:tr>
-        <w:tblPrEx>
-          <w:tblCellMar>
-            <w:top w:w="0" w:type="dxa"/>
-            <w:bottom w:w="0" w:type="dxa"/>
-          </w:tblCellMar>
-        </w:tblPrEx>
         <w:trPr>
           <w:cantSplit/>
           <w:tblHeader/>
@@ -16513,12 +15617,6 @@
         </w:tc>
       </w:tr>
       <w:tr>
-        <w:tblPrEx>
-          <w:tblCellMar>
-            <w:top w:w="0" w:type="dxa"/>
-            <w:bottom w:w="0" w:type="dxa"/>
-          </w:tblCellMar>
-        </w:tblPrEx>
         <w:trPr>
           <w:cantSplit/>
         </w:trPr>
@@ -16605,12 +15703,6 @@
         </w:tc>
       </w:tr>
       <w:tr>
-        <w:tblPrEx>
-          <w:tblCellMar>
-            <w:top w:w="0" w:type="dxa"/>
-            <w:bottom w:w="0" w:type="dxa"/>
-          </w:tblCellMar>
-        </w:tblPrEx>
         <w:trPr>
           <w:cantSplit/>
         </w:trPr>
@@ -16697,12 +15789,6 @@
         </w:tc>
       </w:tr>
       <w:tr>
-        <w:tblPrEx>
-          <w:tblCellMar>
-            <w:top w:w="0" w:type="dxa"/>
-            <w:bottom w:w="0" w:type="dxa"/>
-          </w:tblCellMar>
-        </w:tblPrEx>
         <w:trPr>
           <w:cantSplit/>
         </w:trPr>
@@ -16789,12 +15875,6 @@
         </w:tc>
       </w:tr>
       <w:tr>
-        <w:tblPrEx>
-          <w:tblCellMar>
-            <w:top w:w="0" w:type="dxa"/>
-            <w:bottom w:w="0" w:type="dxa"/>
-          </w:tblCellMar>
-        </w:tblPrEx>
         <w:trPr>
           <w:cantSplit/>
         </w:trPr>
@@ -16913,12 +15993,6 @@
         <w:gridCol w:w="6026"/>
       </w:tblGrid>
       <w:tr>
-        <w:tblPrEx>
-          <w:tblCellMar>
-            <w:top w:w="0" w:type="dxa"/>
-            <w:bottom w:w="0" w:type="dxa"/>
-          </w:tblCellMar>
-        </w:tblPrEx>
         <w:trPr>
           <w:cantSplit/>
           <w:tblHeader/>
@@ -16987,12 +16061,6 @@
         </w:tc>
       </w:tr>
       <w:tr>
-        <w:tblPrEx>
-          <w:tblCellMar>
-            <w:top w:w="0" w:type="dxa"/>
-            <w:bottom w:w="0" w:type="dxa"/>
-          </w:tblCellMar>
-        </w:tblPrEx>
         <w:trPr>
           <w:cantSplit/>
         </w:trPr>
@@ -17054,12 +16122,6 @@
         </w:tc>
       </w:tr>
       <w:tr>
-        <w:tblPrEx>
-          <w:tblCellMar>
-            <w:top w:w="0" w:type="dxa"/>
-            <w:bottom w:w="0" w:type="dxa"/>
-          </w:tblCellMar>
-        </w:tblPrEx>
         <w:trPr>
           <w:cantSplit/>
         </w:trPr>
@@ -17123,12 +16185,6 @@
         </w:tc>
       </w:tr>
       <w:tr>
-        <w:tblPrEx>
-          <w:tblCellMar>
-            <w:top w:w="0" w:type="dxa"/>
-            <w:bottom w:w="0" w:type="dxa"/>
-          </w:tblCellMar>
-        </w:tblPrEx>
         <w:trPr>
           <w:cantSplit/>
         </w:trPr>
@@ -17190,12 +16246,6 @@
         </w:tc>
       </w:tr>
       <w:tr>
-        <w:tblPrEx>
-          <w:tblCellMar>
-            <w:top w:w="0" w:type="dxa"/>
-            <w:bottom w:w="0" w:type="dxa"/>
-          </w:tblCellMar>
-        </w:tblPrEx>
         <w:trPr>
           <w:cantSplit/>
         </w:trPr>
@@ -17259,12 +16309,6 @@
         </w:tc>
       </w:tr>
       <w:tr>
-        <w:tblPrEx>
-          <w:tblCellMar>
-            <w:top w:w="0" w:type="dxa"/>
-            <w:bottom w:w="0" w:type="dxa"/>
-          </w:tblCellMar>
-        </w:tblPrEx>
         <w:trPr>
           <w:cantSplit/>
         </w:trPr>
@@ -17326,12 +16370,6 @@
         </w:tc>
       </w:tr>
       <w:tr>
-        <w:tblPrEx>
-          <w:tblCellMar>
-            <w:top w:w="0" w:type="dxa"/>
-            <w:bottom w:w="0" w:type="dxa"/>
-          </w:tblCellMar>
-        </w:tblPrEx>
         <w:trPr>
           <w:cantSplit/>
         </w:trPr>
@@ -17395,12 +16433,6 @@
         </w:tc>
       </w:tr>
       <w:tr>
-        <w:tblPrEx>
-          <w:tblCellMar>
-            <w:top w:w="0" w:type="dxa"/>
-            <w:bottom w:w="0" w:type="dxa"/>
-          </w:tblCellMar>
-        </w:tblPrEx>
         <w:trPr>
           <w:cantSplit/>
         </w:trPr>
@@ -17462,12 +16494,6 @@
         </w:tc>
       </w:tr>
       <w:tr>
-        <w:tblPrEx>
-          <w:tblCellMar>
-            <w:top w:w="0" w:type="dxa"/>
-            <w:bottom w:w="0" w:type="dxa"/>
-          </w:tblCellMar>
-        </w:tblPrEx>
         <w:trPr>
           <w:cantSplit/>
         </w:trPr>
@@ -17531,12 +16557,6 @@
         </w:tc>
       </w:tr>
       <w:tr>
-        <w:tblPrEx>
-          <w:tblCellMar>
-            <w:top w:w="0" w:type="dxa"/>
-            <w:bottom w:w="0" w:type="dxa"/>
-          </w:tblCellMar>
-        </w:tblPrEx>
         <w:trPr>
           <w:cantSplit/>
         </w:trPr>
@@ -17615,13 +16635,7 @@
         <w:rPr>
           <w:rFonts w:cs="Calibri"/>
         </w:rPr>
-        <w:t>Each purchase line is stored twice for two different purposes: purchase_detail is the bill as printed (quantity and rate), while stock_lot is the physical batch that carrie</w:t>
-      </w:r>
-      <w:r>
-        <w:rPr>
-          <w:rFonts w:cs="Calibri"/>
-        </w:rPr>
-        <w:t>s the cost and expiry date and counts down as goods are sold. Because one purchase line equals one lot, the same product may appear twice in one bill with different expiry dates.</w:t>
+        <w:t>Each purchase line is stored twice for two different purposes: purchase_detail is the bill as printed (quantity and rate), while stock_lot is the physical batch that carries the cost and expiry date and counts down as goods are sold. Because one purchase line equals one lot, the same product may appear twice in one bill with different expiry dates.</w:t>
       </w:r>
     </w:p>
     <w:p>
@@ -17701,10 +16715,7 @@
         <w:spacing w:after="60"/>
       </w:pPr>
       <w:r>
-        <w:t xml:space="preserve">Insert </w:t>
-      </w:r>
-      <w:r>
-        <w:t>the sale header (customer or walk-in, discount).</w:t>
+        <w:t>Insert the sale header (customer or walk-in, discount).</w:t>
       </w:r>
     </w:p>
     <w:p>
@@ -17730,10 +16741,7 @@
         <w:spacing w:after="60"/>
       </w:pPr>
       <w:r>
-        <w:t>Reduce qty_left of the chose</w:t>
-      </w:r>
-      <w:r>
-        <w:t>n lots and record each consumption in sale_lot (this gives exact COGS and a full audit trail).</w:t>
+        <w:t>Reduce qty_left of the chosen lots and record each consumption in sale_lot (this gives exact COGS and a full audit trail).</w:t>
       </w:r>
     </w:p>
     <w:p>
@@ -17791,12 +16799,6 @@
         <w:gridCol w:w="5726"/>
       </w:tblGrid>
       <w:tr>
-        <w:tblPrEx>
-          <w:tblCellMar>
-            <w:top w:w="0" w:type="dxa"/>
-            <w:bottom w:w="0" w:type="dxa"/>
-          </w:tblCellMar>
-        </w:tblPrEx>
         <w:trPr>
           <w:cantSplit/>
           <w:tblHeader/>
@@ -17865,12 +16867,6 @@
         </w:tc>
       </w:tr>
       <w:tr>
-        <w:tblPrEx>
-          <w:tblCellMar>
-            <w:top w:w="0" w:type="dxa"/>
-            <w:bottom w:w="0" w:type="dxa"/>
-          </w:tblCellMar>
-        </w:tblPrEx>
         <w:trPr>
           <w:cantSplit/>
         </w:trPr>
@@ -17897,15 +16893,7 @@
                 <w:sz w:val="20"/>
                 <w:szCs w:val="20"/>
               </w:rPr>
-              <w:t>products.stock_quantity, purchase_pri</w:t>
-            </w:r>
-            <w:r>
-              <w:rPr>
-                <w:rFonts w:cs="Calibri"/>
-                <w:sz w:val="20"/>
-                <w:szCs w:val="20"/>
-              </w:rPr>
-              <w:t>ce, expiry_date</w:t>
+              <w:t>products.stock_quantity, purchase_price, expiry_date</w:t>
             </w:r>
           </w:p>
         </w:tc>
@@ -17938,12 +16926,6 @@
         </w:tc>
       </w:tr>
       <w:tr>
-        <w:tblPrEx>
-          <w:tblCellMar>
-            <w:top w:w="0" w:type="dxa"/>
-            <w:bottom w:w="0" w:type="dxa"/>
-          </w:tblCellMar>
-        </w:tblPrEx>
         <w:trPr>
           <w:cantSplit/>
         </w:trPr>
@@ -18005,12 +16987,6 @@
         </w:tc>
       </w:tr>
       <w:tr>
-        <w:tblPrEx>
-          <w:tblCellMar>
-            <w:top w:w="0" w:type="dxa"/>
-            <w:bottom w:w="0" w:type="dxa"/>
-          </w:tblCellMar>
-        </w:tblPrEx>
         <w:trPr>
           <w:cantSplit/>
         </w:trPr>
@@ -18070,12 +17046,6 @@
         </w:tc>
       </w:tr>
       <w:tr>
-        <w:tblPrEx>
-          <w:tblCellMar>
-            <w:top w:w="0" w:type="dxa"/>
-            <w:bottom w:w="0" w:type="dxa"/>
-          </w:tblCellMar>
-        </w:tblPrEx>
         <w:trPr>
           <w:cantSplit/>
         </w:trPr>
@@ -18138,12 +17108,6 @@
         </w:tc>
       </w:tr>
       <w:tr>
-        <w:tblPrEx>
-          <w:tblCellMar>
-            <w:top w:w="0" w:type="dxa"/>
-            <w:bottom w:w="0" w:type="dxa"/>
-          </w:tblCellMar>
-        </w:tblPrEx>
         <w:trPr>
           <w:cantSplit/>
         </w:trPr>
@@ -18203,12 +17167,6 @@
         </w:tc>
       </w:tr>
       <w:tr>
-        <w:tblPrEx>
-          <w:tblCellMar>
-            <w:top w:w="0" w:type="dxa"/>
-            <w:bottom w:w="0" w:type="dxa"/>
-          </w:tblCellMar>
-        </w:tblPrEx>
         <w:trPr>
           <w:cantSplit/>
         </w:trPr>
@@ -18270,12 +17228,6 @@
         </w:tc>
       </w:tr>
       <w:tr>
-        <w:tblPrEx>
-          <w:tblCellMar>
-            <w:top w:w="0" w:type="dxa"/>
-            <w:bottom w:w="0" w:type="dxa"/>
-          </w:tblCellMar>
-        </w:tblPrEx>
         <w:trPr>
           <w:cantSplit/>
         </w:trPr>
@@ -18335,12 +17287,6 @@
         </w:tc>
       </w:tr>
       <w:tr>
-        <w:tblPrEx>
-          <w:tblCellMar>
-            <w:top w:w="0" w:type="dxa"/>
-            <w:bottom w:w="0" w:type="dxa"/>
-          </w:tblCellMar>
-        </w:tblPrEx>
         <w:trPr>
           <w:cantSplit/>
         </w:trPr>
@@ -18537,15 +17483,7 @@
           <w:sz w:val="18"/>
           <w:szCs w:val="18"/>
         </w:rPr>
-        <w:t>SELE</w:t>
-      </w:r>
-      <w:r>
-        <w:rPr>
-          <w:rFonts w:ascii="Consolas" w:eastAsia="Consolas" w:hAnsi="Consolas" w:cs="Consolas"/>
-          <w:sz w:val="18"/>
-          <w:szCs w:val="18"/>
-        </w:rPr>
-        <w:t>CT p.product_name, v.stock, p.minimum_stock</w:t>
+        <w:t>SELECT p.product_name, v.stock, p.minimum_stock</w:t>
       </w:r>
     </w:p>
     <w:p>
@@ -18693,15 +17631,7 @@
           <w:sz w:val="18"/>
           <w:szCs w:val="18"/>
         </w:rPr>
-        <w:t xml:space="preserve">       SUM(sl.quant</w:t>
-      </w:r>
-      <w:r>
-        <w:rPr>
-          <w:rFonts w:ascii="Consolas" w:eastAsia="Consolas" w:hAnsi="Consolas" w:cs="Consolas"/>
-          <w:sz w:val="18"/>
-          <w:szCs w:val="18"/>
-        </w:rPr>
-        <w:t>ity * l.unit_cost) AS cogs</w:t>
+        <w:t xml:space="preserve">       SUM(sl.quantity * l.unit_cost) AS cogs</w:t>
       </w:r>
     </w:p>
     <w:p>
@@ -18796,19 +17726,7 @@
         <w:rPr>
           <w:rFonts w:cs="Calibri"/>
         </w:rPr>
-        <w:t xml:space="preserve">Every </w:t>
-      </w:r>
-      <w:r>
-        <w:rPr>
-          <w:rFonts w:cs="Calibri"/>
-        </w:rPr>
-        <w:t xml:space="preserve">form below maps to an entity, attribute set or relationship of the ER diagram. Foreign keys are chosen from dropdowns (never typed), money uses number inputs with step 0.01, dates use date inputs, and required fields are validated in the browser and again </w:t>
-      </w:r>
-      <w:r>
-        <w:rPr>
-          <w:rFonts w:cs="Calibri"/>
-        </w:rPr>
-        <w:t>in PHP.</w:t>
+        <w:t>Every form below maps to an entity, attribute set or relationship of the ER diagram. Foreign keys are chosen from dropdowns (never typed), money uses number inputs with step 0.01, dates use date inputs, and required fields are validated in the browser and again in PHP.</w:t>
       </w:r>
     </w:p>
     <w:tbl>
@@ -18835,12 +17753,6 @@
         <w:gridCol w:w="2726"/>
       </w:tblGrid>
       <w:tr>
-        <w:tblPrEx>
-          <w:tblCellMar>
-            <w:top w:w="0" w:type="dxa"/>
-            <w:bottom w:w="0" w:type="dxa"/>
-          </w:tblCellMar>
-        </w:tblPrEx>
         <w:trPr>
           <w:cantSplit/>
           <w:tblHeader/>
@@ -18971,12 +17883,6 @@
         </w:tc>
       </w:tr>
       <w:tr>
-        <w:tblPrEx>
-          <w:tblCellMar>
-            <w:top w:w="0" w:type="dxa"/>
-            <w:bottom w:w="0" w:type="dxa"/>
-          </w:tblCellMar>
-        </w:tblPrEx>
         <w:trPr>
           <w:cantSplit/>
         </w:trPr>
@@ -19090,12 +17996,6 @@
         </w:tc>
       </w:tr>
       <w:tr>
-        <w:tblPrEx>
-          <w:tblCellMar>
-            <w:top w:w="0" w:type="dxa"/>
-            <w:bottom w:w="0" w:type="dxa"/>
-          </w:tblCellMar>
-        </w:tblPrEx>
         <w:trPr>
           <w:cantSplit/>
         </w:trPr>
@@ -19214,12 +18114,6 @@
         </w:tc>
       </w:tr>
       <w:tr>
-        <w:tblPrEx>
-          <w:tblCellMar>
-            <w:top w:w="0" w:type="dxa"/>
-            <w:bottom w:w="0" w:type="dxa"/>
-          </w:tblCellMar>
-        </w:tblPrEx>
         <w:trPr>
           <w:cantSplit/>
         </w:trPr>
@@ -19333,12 +18227,6 @@
         </w:tc>
       </w:tr>
       <w:tr>
-        <w:tblPrEx>
-          <w:tblCellMar>
-            <w:top w:w="0" w:type="dxa"/>
-            <w:bottom w:w="0" w:type="dxa"/>
-          </w:tblCellMar>
-        </w:tblPrEx>
         <w:trPr>
           <w:cantSplit/>
         </w:trPr>
@@ -19456,12 +18344,6 @@
         </w:tc>
       </w:tr>
       <w:tr>
-        <w:tblPrEx>
-          <w:tblCellMar>
-            <w:top w:w="0" w:type="dxa"/>
-            <w:bottom w:w="0" w:type="dxa"/>
-          </w:tblCellMar>
-        </w:tblPrEx>
         <w:trPr>
           <w:cantSplit/>
         </w:trPr>
@@ -19575,12 +18457,6 @@
         </w:tc>
       </w:tr>
       <w:tr>
-        <w:tblPrEx>
-          <w:tblCellMar>
-            <w:top w:w="0" w:type="dxa"/>
-            <w:bottom w:w="0" w:type="dxa"/>
-          </w:tblCellMar>
-        </w:tblPrEx>
         <w:trPr>
           <w:cantSplit/>
         </w:trPr>
@@ -19698,12 +18574,6 @@
         </w:tc>
       </w:tr>
       <w:tr>
-        <w:tblPrEx>
-          <w:tblCellMar>
-            <w:top w:w="0" w:type="dxa"/>
-            <w:bottom w:w="0" w:type="dxa"/>
-          </w:tblCellMar>
-        </w:tblPrEx>
         <w:trPr>
           <w:cantSplit/>
         </w:trPr>
@@ -19817,12 +18687,6 @@
         </w:tc>
       </w:tr>
       <w:tr>
-        <w:tblPrEx>
-          <w:tblCellMar>
-            <w:top w:w="0" w:type="dxa"/>
-            <w:bottom w:w="0" w:type="dxa"/>
-          </w:tblCellMar>
-        </w:tblPrEx>
         <w:trPr>
           <w:cantSplit/>
         </w:trPr>
@@ -19940,12 +18804,6 @@
         </w:tc>
       </w:tr>
       <w:tr>
-        <w:tblPrEx>
-          <w:tblCellMar>
-            <w:top w:w="0" w:type="dxa"/>
-            <w:bottom w:w="0" w:type="dxa"/>
-          </w:tblCellMar>
-        </w:tblPrEx>
         <w:trPr>
           <w:cantSplit/>
         </w:trPr>
@@ -20059,12 +18917,6 @@
         </w:tc>
       </w:tr>
       <w:tr>
-        <w:tblPrEx>
-          <w:tblCellMar>
-            <w:top w:w="0" w:type="dxa"/>
-            <w:bottom w:w="0" w:type="dxa"/>
-          </w:tblCellMar>
-        </w:tblPrEx>
         <w:trPr>
           <w:cantSplit/>
         </w:trPr>
@@ -20182,12 +19034,6 @@
         </w:tc>
       </w:tr>
       <w:tr>
-        <w:tblPrEx>
-          <w:tblCellMar>
-            <w:top w:w="0" w:type="dxa"/>
-            <w:bottom w:w="0" w:type="dxa"/>
-          </w:tblCellMar>
-        </w:tblPrEx>
         <w:trPr>
           <w:cantSplit/>
         </w:trPr>
@@ -20301,12 +19147,6 @@
         </w:tc>
       </w:tr>
       <w:tr>
-        <w:tblPrEx>
-          <w:tblCellMar>
-            <w:top w:w="0" w:type="dxa"/>
-            <w:bottom w:w="0" w:type="dxa"/>
-          </w:tblCellMar>
-        </w:tblPrEx>
         <w:trPr>
           <w:cantSplit/>
         </w:trPr>
@@ -20424,12 +19264,6 @@
         </w:tc>
       </w:tr>
       <w:tr>
-        <w:tblPrEx>
-          <w:tblCellMar>
-            <w:top w:w="0" w:type="dxa"/>
-            <w:bottom w:w="0" w:type="dxa"/>
-          </w:tblCellMar>
-        </w:tblPrEx>
         <w:trPr>
           <w:cantSplit/>
         </w:trPr>
@@ -20560,13 +19394,7 @@
         <w:rPr>
           <w:rFonts w:cs="Calibri"/>
         </w:rPr>
-        <w:t>Every form validates instantly in JavaScript and every API endpoint re-validates in PHP before touching the database. Invalid input gets HTTP 422 with a message; ghost foreign keys get 422 instead of a database error; overselling gets 409. The CHECK constr</w:t>
-      </w:r>
-      <w:r>
-        <w:rPr>
-          <w:rFonts w:cs="Calibri"/>
-        </w:rPr>
-        <w:t>aints in the schema are a last line of defence.</w:t>
+        <w:t>Every form validates instantly in JavaScript and every API endpoint re-validates in PHP before touching the database. Invalid input gets HTTP 422 with a message; ghost foreign keys get 422 instead of a database error; overselling gets 409. The CHECK constraints in the schema are a last line of defence.</w:t>
       </w:r>
     </w:p>
     <w:tbl>
@@ -20592,12 +19420,6 @@
         <w:gridCol w:w="1800"/>
       </w:tblGrid>
       <w:tr>
-        <w:tblPrEx>
-          <w:tblCellMar>
-            <w:top w:w="0" w:type="dxa"/>
-            <w:bottom w:w="0" w:type="dxa"/>
-          </w:tblCellMar>
-        </w:tblPrEx>
         <w:trPr>
           <w:cantSplit/>
           <w:tblHeader/>
@@ -20697,12 +19519,6 @@
         </w:tc>
       </w:tr>
       <w:tr>
-        <w:tblPrEx>
-          <w:tblCellMar>
-            <w:top w:w="0" w:type="dxa"/>
-            <w:bottom w:w="0" w:type="dxa"/>
-          </w:tblCellMar>
-        </w:tblPrEx>
         <w:trPr>
           <w:cantSplit/>
         </w:trPr>
@@ -20789,12 +19605,6 @@
         </w:tc>
       </w:tr>
       <w:tr>
-        <w:tblPrEx>
-          <w:tblCellMar>
-            <w:top w:w="0" w:type="dxa"/>
-            <w:bottom w:w="0" w:type="dxa"/>
-          </w:tblCellMar>
-        </w:tblPrEx>
         <w:trPr>
           <w:cantSplit/>
         </w:trPr>
@@ -20885,12 +19695,6 @@
         </w:tc>
       </w:tr>
       <w:tr>
-        <w:tblPrEx>
-          <w:tblCellMar>
-            <w:top w:w="0" w:type="dxa"/>
-            <w:bottom w:w="0" w:type="dxa"/>
-          </w:tblCellMar>
-        </w:tblPrEx>
         <w:trPr>
           <w:cantSplit/>
         </w:trPr>
@@ -20977,12 +19781,6 @@
         </w:tc>
       </w:tr>
       <w:tr>
-        <w:tblPrEx>
-          <w:tblCellMar>
-            <w:top w:w="0" w:type="dxa"/>
-            <w:bottom w:w="0" w:type="dxa"/>
-          </w:tblCellMar>
-        </w:tblPrEx>
         <w:trPr>
           <w:cantSplit/>
         </w:trPr>
@@ -21072,12 +19870,6 @@
         </w:tc>
       </w:tr>
       <w:tr>
-        <w:tblPrEx>
-          <w:tblCellMar>
-            <w:top w:w="0" w:type="dxa"/>
-            <w:bottom w:w="0" w:type="dxa"/>
-          </w:tblCellMar>
-        </w:tblPrEx>
         <w:trPr>
           <w:cantSplit/>
         </w:trPr>
@@ -21164,12 +19956,6 @@
         </w:tc>
       </w:tr>
       <w:tr>
-        <w:tblPrEx>
-          <w:tblCellMar>
-            <w:top w:w="0" w:type="dxa"/>
-            <w:bottom w:w="0" w:type="dxa"/>
-          </w:tblCellMar>
-        </w:tblPrEx>
         <w:trPr>
           <w:cantSplit/>
         </w:trPr>
@@ -21259,12 +20045,6 @@
         </w:tc>
       </w:tr>
       <w:tr>
-        <w:tblPrEx>
-          <w:tblCellMar>
-            <w:top w:w="0" w:type="dxa"/>
-            <w:bottom w:w="0" w:type="dxa"/>
-          </w:tblCellMar>
-        </w:tblPrEx>
         <w:trPr>
           <w:cantSplit/>
         </w:trPr>
@@ -21351,12 +20131,6 @@
         </w:tc>
       </w:tr>
       <w:tr>
-        <w:tblPrEx>
-          <w:tblCellMar>
-            <w:top w:w="0" w:type="dxa"/>
-            <w:bottom w:w="0" w:type="dxa"/>
-          </w:tblCellMar>
-        </w:tblPrEx>
         <w:trPr>
           <w:cantSplit/>
         </w:trPr>
@@ -21463,13 +20237,7 @@
         <w:rPr>
           <w:rFonts w:cs="Calibri"/>
         </w:rPr>
-        <w:t xml:space="preserve">The backend detects the role from the account itself (admin → Owner, manager → Manager, staff → Cashier). Owner sees everything; Manager sees everything except Expenses; Cashier gets a separate Cashier Dashboard (today's bills, cash and due only) plus New </w:t>
-      </w:r>
-      <w:r>
-        <w:rPr>
-          <w:rFonts w:cs="Calibri"/>
-        </w:rPr>
-        <w:t>Sale and Customers — never profit, purchase cost, expenses or reports. Typing a restricted page URL bounces the user to their home page.</w:t>
+        <w:t>The backend detects the role from the account itself (admin → Owner, manager → Manager, staff → Cashier). Owner sees everything; Manager sees everything except Expenses; Cashier gets a separate Cashier Dashboard (today's bills, cash and due only) plus New Sale and Customers — never profit, purchase cost, expenses or reports. Typing a restricted page URL bounces the user to their home page.</w:t>
       </w:r>
     </w:p>
     <w:p>
@@ -21506,8 +20274,6 @@
       <w:r>
         <w:t xml:space="preserve">Copy the project folder to C:\xampp\htdocs\ </w:t>
       </w:r>
-      <w:bookmarkStart w:id="0" w:name="_GoBack"/>
-      <w:bookmarkEnd w:id="0"/>
     </w:p>
     <w:p>
       <w:pPr>
@@ -21532,10 +20298,7 @@
         <w:spacing w:after="60"/>
       </w:pPr>
       <w:r>
-        <w:t>Open the site in the browser and sign in — Owne</w:t>
-      </w:r>
-      <w:r>
-        <w:t>r: admin / admin123 (manager and cashier accounts are also seeded).</w:t>
+        <w:t>Open the site in the browser and sign in — Owner: admin / admin123 (manager and cashier accounts are also seeded).</w:t>
       </w:r>
     </w:p>
     <w:p>
@@ -21631,7 +20394,7 @@
         <w:sz w:val="18"/>
         <w:szCs w:val="18"/>
       </w:rPr>
-      <w:t>3</w:t>
+      <w:t>1</w:t>
     </w:r>
     <w:r>
       <w:rPr>
@@ -21761,7 +20524,7 @@
         <w:sz w:val="18"/>
         <w:szCs w:val="18"/>
       </w:rPr>
-      <w:t>10</w:t>
+      <w:t>13</w:t>
     </w:r>
     <w:r>
       <w:rPr>

</xml_diff>

<commit_message>
Implement staff access and password workflows
Adds full staff/account management with new Staff & Access and My Account pages, plus new `api/users.php` and `api/password.php` for role-based hiring/editing, password-change approvals, forgot-password email codes, and login lock/unlock handling. It also wires auditability and security improvements across auth and transactions (recorded-by fields on sales/purchases/expenses, session/user upgrades, business-date/timezone consistency, safer money rounding and due logic), extends master data fields (product barcode, supplier/customer email/address/contact info), and updates UI/docs/config (favicon/theme meta, SMTP config with local outbox fallback, README and schema updates).
</commit_message>
<xml_diff>
--- a/documentation/GMS_Requirement_Analysis_and_Design.docx
+++ b/documentation/GMS_Requirement_Analysis_and_Design.docx
@@ -1889,7 +1889,93 @@
                 <w:sz w:val="20"/>
                 <w:szCs w:val="20"/>
               </w:rPr>
-              <w:t>app_user.role</w:t>
+              <w:t xml:space="preserve">app_user.role (admin / manager / staff)</w:t>
+            </w:r>
+          </w:p>
+        </w:tc>
+      </w:tr>
+      <w:tr>
+        <w:trPr>
+          <w:cantSplit/>
+        </w:trPr>
+        <w:tc>
+          <w:tcPr>
+            <w:tcW w:w="700" w:type="dxa"/>
+            <w:tcBorders>
+              <w:top w:val="single" w:sz="4" w:space="0" w:color="BFBFBF"/>
+              <w:left w:val="single" w:sz="4" w:space="0" w:color="BFBFBF"/>
+              <w:bottom w:val="single" w:sz="4" w:space="0" w:color="BFBFBF"/>
+              <w:right w:val="single" w:sz="4" w:space="0" w:color="BFBFBF"/>
+            </w:tcBorders>
+            <w:tcMar>
+              <w:top w:w="60" w:type="dxa"/>
+              <w:left w:w="100" w:type="dxa"/>
+              <w:bottom w:w="60" w:type="dxa"/>
+              <w:right w:w="100" w:type="dxa"/>
+            </w:tcMar>
+          </w:tcPr>
+          <w:p>
+            <w:r>
+              <w:rPr>
+                <w:rFonts w:cs="Calibri"/>
+                <w:sz w:val="20"/>
+                <w:szCs w:val="20"/>
+              </w:rPr>
+              <w:t xml:space="preserve">R10</w:t>
+            </w:r>
+          </w:p>
+        </w:tc>
+        <w:tc>
+          <w:tcPr>
+            <w:tcW w:w="4300" w:type="dxa"/>
+            <w:tcBorders>
+              <w:top w:val="single" w:sz="4" w:space="0" w:color="BFBFBF"/>
+              <w:left w:val="single" w:sz="4" w:space="0" w:color="BFBFBF"/>
+              <w:bottom w:val="single" w:sz="4" w:space="0" w:color="BFBFBF"/>
+              <w:right w:val="single" w:sz="4" w:space="0" w:color="BFBFBF"/>
+            </w:tcBorders>
+            <w:tcMar>
+              <w:top w:w="60" w:type="dxa"/>
+              <w:left w:w="100" w:type="dxa"/>
+              <w:bottom w:w="60" w:type="dxa"/>
+              <w:right w:w="100" w:type="dxa"/>
+            </w:tcMar>
+          </w:tcPr>
+          <w:p>
+            <w:r>
+              <w:rPr>
+                <w:rFonts w:cs="Calibri"/>
+                <w:sz w:val="20"/>
+                <w:szCs w:val="20"/>
+              </w:rPr>
+              <w:t xml:space="preserve">Record which user entered each sale, purchase and expense, so every transaction can be traced to a person</w:t>
+            </w:r>
+          </w:p>
+        </w:tc>
+        <w:tc>
+          <w:tcPr>
+            <w:tcW w:w="4026" w:type="dxa"/>
+            <w:tcBorders>
+              <w:top w:val="single" w:sz="4" w:space="0" w:color="BFBFBF"/>
+              <w:left w:val="single" w:sz="4" w:space="0" w:color="BFBFBF"/>
+              <w:bottom w:val="single" w:sz="4" w:space="0" w:color="BFBFBF"/>
+              <w:right w:val="single" w:sz="4" w:space="0" w:color="BFBFBF"/>
+            </w:tcBorders>
+            <w:tcMar>
+              <w:top w:w="60" w:type="dxa"/>
+              <w:left w:w="100" w:type="dxa"/>
+              <w:bottom w:w="60" w:type="dxa"/>
+              <w:right w:w="100" w:type="dxa"/>
+            </w:tcMar>
+          </w:tcPr>
+          <w:p>
+            <w:r>
+              <w:rPr>
+                <w:rFonts w:cs="Calibri"/>
+                <w:sz w:val="20"/>
+                <w:szCs w:val="20"/>
+              </w:rPr>
+              <w:t xml:space="preserve">sale.user_id, purchase.user_id, expense.user_id → app_user</w:t>
             </w:r>
           </w:p>
         </w:tc>
@@ -1925,7 +2011,7 @@
         <w:rPr>
           <w:rFonts w:cs="Calibri"/>
         </w:rPr>
-        <w:t>The diagram below shows all entities, attributes and relationships of the system. Primary key attributes are bold and underlined; foreign key attributes are in italics. The diamonds are relationships with their cardinality (1 : M).</w:t>
+        <w:t xml:space="preserve">The diagram below shows all entities, attributes and relationships of the system. Primary key attributes are bold and underlined. Foreign keys are not drawn as attributes; the diamonds are the relationships, with their cardinality (1 : M), and the foreign key columns that implement them are listed in Section 3.</w:t>
       </w:r>
     </w:p>
     <w:p>
@@ -1940,7 +2026,7 @@
         </w:rPr>
         <w:drawing>
           <wp:inline distT="0" distB="0" distL="0" distR="0">
-            <wp:extent cx="8382000" cy="5108953"/>
+            <wp:extent cx="8382000" cy="4693920"/>
             <wp:effectExtent l="0" t="0" r="0" b="0"/>
             <wp:docPr id="1" name="er" descr="ER diagram of the Grocery Management System" title="ER diagram"/>
             <wp:cNvGraphicFramePr>
@@ -1965,7 +2051,7 @@
                   <pic:spPr bwMode="auto">
                     <a:xfrm>
                       <a:off x="0" y="0"/>
-                      <a:ext cx="8382000" cy="5108953"/>
+                      <a:ext cx="8382000" cy="4693920"/>
                     </a:xfrm>
                     <a:prstGeom prst="rect">
                       <a:avLst/>
@@ -1990,7 +2076,7 @@
           <w:sz w:val="20"/>
           <w:szCs w:val="20"/>
         </w:rPr>
-        <w:t>Figure 1: ER diagram — 14 entities. app_user and expense are standalone; the rest form the purchase / stock-lot / sale chain around product.</w:t>
+        <w:t xml:space="preserve">Figure 1: ER diagram — 14 entities. app_user records every sale, purchase and expense (1 : M each); the rest form the purchase / stock-lot / sale chain around product.</w:t>
       </w:r>
     </w:p>
     <w:p>
@@ -3299,7 +3385,7 @@
                 <w:sz w:val="20"/>
                 <w:szCs w:val="20"/>
               </w:rPr>
-              <w:t>app_user (standalone)</w:t>
+              <w:t xml:space="preserve">app_user → sale</w:t>
             </w:r>
           </w:p>
         </w:tc>
@@ -3327,7 +3413,7 @@
                 <w:sz w:val="20"/>
                 <w:szCs w:val="20"/>
               </w:rPr>
-              <w:t>—</w:t>
+              <w:t xml:space="preserve">1 : N</w:t>
             </w:r>
           </w:p>
         </w:tc>
@@ -3355,7 +3441,7 @@
                 <w:sz w:val="20"/>
                 <w:szCs w:val="20"/>
               </w:rPr>
-              <w:t>Login accounts with roles admin / manager / staff.</w:t>
+              <w:t xml:space="preserve">One user records many sales; every sale stores the user who rang it up (taken from the login session).</w:t>
             </w:r>
           </w:p>
         </w:tc>
@@ -3387,7 +3473,7 @@
                 <w:sz w:val="20"/>
                 <w:szCs w:val="20"/>
               </w:rPr>
-              <w:t>expense (standalone)</w:t>
+              <w:t xml:space="preserve">app_user → purchase</w:t>
             </w:r>
           </w:p>
         </w:tc>
@@ -3414,7 +3500,7 @@
                 <w:sz w:val="20"/>
                 <w:szCs w:val="20"/>
               </w:rPr>
-              <w:t>—</w:t>
+              <w:t xml:space="preserve">1 : N</w:t>
             </w:r>
           </w:p>
         </w:tc>
@@ -3441,7 +3527,93 @@
                 <w:sz w:val="20"/>
                 <w:szCs w:val="20"/>
               </w:rPr>
-              <w:t>Shop running costs (rent, electricity, transport).</w:t>
+              <w:t xml:space="preserve">One user records many purchase bills; every purchase stores the user who entered it.</w:t>
+            </w:r>
+          </w:p>
+        </w:tc>
+      </w:tr>
+      <w:tr>
+        <w:trPr>
+          <w:cantSplit/>
+        </w:trPr>
+        <w:tc>
+          <w:tcPr>
+            <w:tcW w:w="2900" w:type="dxa"/>
+            <w:tcBorders>
+              <w:top w:val="single" w:sz="4" w:space="0" w:color="BFBFBF"/>
+              <w:left w:val="single" w:sz="4" w:space="0" w:color="BFBFBF"/>
+              <w:bottom w:val="single" w:sz="4" w:space="0" w:color="BFBFBF"/>
+              <w:right w:val="single" w:sz="4" w:space="0" w:color="BFBFBF"/>
+            </w:tcBorders>
+            <w:tcMar>
+              <w:top w:w="60" w:type="dxa"/>
+              <w:left w:w="100" w:type="dxa"/>
+              <w:bottom w:w="60" w:type="dxa"/>
+              <w:right w:w="100" w:type="dxa"/>
+            </w:tcMar>
+          </w:tcPr>
+          <w:p>
+            <w:r>
+              <w:rPr>
+                <w:rFonts w:cs="Calibri"/>
+                <w:sz w:val="20"/>
+                <w:szCs w:val="20"/>
+              </w:rPr>
+              <w:t xml:space="preserve">app_user → expense</w:t>
+            </w:r>
+          </w:p>
+        </w:tc>
+        <w:tc>
+          <w:tcPr>
+            <w:tcW w:w="1500" w:type="dxa"/>
+            <w:tcBorders>
+              <w:top w:val="single" w:sz="4" w:space="0" w:color="BFBFBF"/>
+              <w:left w:val="single" w:sz="4" w:space="0" w:color="BFBFBF"/>
+              <w:bottom w:val="single" w:sz="4" w:space="0" w:color="BFBFBF"/>
+              <w:right w:val="single" w:sz="4" w:space="0" w:color="BFBFBF"/>
+            </w:tcBorders>
+            <w:tcMar>
+              <w:top w:w="60" w:type="dxa"/>
+              <w:left w:w="100" w:type="dxa"/>
+              <w:bottom w:w="60" w:type="dxa"/>
+              <w:right w:w="100" w:type="dxa"/>
+            </w:tcMar>
+          </w:tcPr>
+          <w:p>
+            <w:r>
+              <w:rPr>
+                <w:rFonts w:cs="Calibri"/>
+                <w:sz w:val="20"/>
+                <w:szCs w:val="20"/>
+              </w:rPr>
+              <w:t xml:space="preserve">1 : N</w:t>
+            </w:r>
+          </w:p>
+        </w:tc>
+        <w:tc>
+          <w:tcPr>
+            <w:tcW w:w="4626" w:type="dxa"/>
+            <w:tcBorders>
+              <w:top w:val="single" w:sz="4" w:space="0" w:color="BFBFBF"/>
+              <w:left w:val="single" w:sz="4" w:space="0" w:color="BFBFBF"/>
+              <w:bottom w:val="single" w:sz="4" w:space="0" w:color="BFBFBF"/>
+              <w:right w:val="single" w:sz="4" w:space="0" w:color="BFBFBF"/>
+            </w:tcBorders>
+            <w:tcMar>
+              <w:top w:w="60" w:type="dxa"/>
+              <w:left w:w="100" w:type="dxa"/>
+              <w:bottom w:w="60" w:type="dxa"/>
+              <w:right w:w="100" w:type="dxa"/>
+            </w:tcMar>
+          </w:tcPr>
+          <w:p>
+            <w:r>
+              <w:rPr>
+                <w:rFonts w:cs="Calibri"/>
+                <w:sz w:val="20"/>
+                <w:szCs w:val="20"/>
+              </w:rPr>
+              <w:t xml:space="preserve">One user records many expenses; every expense stores the user who entered it.</w:t>
             </w:r>
           </w:p>
         </w:tc>
@@ -3464,7 +3636,7 @@
         <w:rPr>
           <w:rFonts w:cs="Calibri"/>
         </w:rPr>
-        <w:t>Primary keys are surrogate integer IDs (AUTO_INCREMENT); the two link tables (product_supplier, sale_lot) use composite primary keys. Foreign keys enforce referential integrity with ON DELETE RESTRICT for business history (products in bills or lots, suppliers with purchases), CASCADE for rows that cannot exist without their parent (bill lines, payments, product–supplier links) and SET NULL where history must survive (a deleted customer or category). Money uses DECIMAL, dates use DATE/DATETIME, roles use ENUM, and CHECK constraints keep quantities positive and prices non-negative.</w:t>
+        <w:t xml:space="preserve">Primary keys are surrogate integer IDs (AUTO_INCREMENT); the two link tables (product_supplier, sale_lot) use composite primary keys. Foreign keys enforce referential integrity with ON DELETE RESTRICT for business history (products in bills or lots, suppliers with purchases, users who recorded a sale, purchase or expense), CASCADE for rows that cannot exist without their parent (bill lines, payments, product–supplier links) and SET NULL where history must survive (a deleted customer or category). Money uses DECIMAL, dates use DATE/DATETIME, roles use ENUM, and CHECK constraints keep quantities positive and prices non-negative.</w:t>
       </w:r>
     </w:p>
     <w:p>
@@ -3476,13 +3648,8 @@
           <w:rFonts w:cs="Calibri"/>
         </w:rPr>
         <w:t xml:space="preserve">Design principle: every table stores only independent facts. Anything that can be computed — bill totals, amount paid, due, stock, average cost, nearest expiry, cost of goods sold — is derived at read time and never stored, so it can never become inconsistent. The schema is in 3NF: every non-key </w:t>
-      </w:r>
-      <w:r>
-        <w:rPr>
-          <w:rFonts w:cs="Calibri"/>
-        </w:rPr>
         <w:lastRenderedPageBreak/>
-        <w:t>attribute depends only on its own table's key, order lines live in detail tables, and there are no repeating groups or transitive dependencies.</w:t>
+        <w:t xml:space="preserve">attribute depends only on its own table's key, order lines live in detail tables, and there are no repeating groups or transitive dependencies. The user who performed a transaction is stored once, as user_id on the header row (sale, purchase, expense); bill lines, payments and lots reach the user through their header, so the value is never copied.</w:t>
       </w:r>
     </w:p>
     <w:tbl>
@@ -3694,7 +3861,7 @@
                 <w:sz w:val="20"/>
                 <w:szCs w:val="20"/>
               </w:rPr>
-              <w:t>Login accounts and roles</w:t>
+              <w:t xml:space="preserve">Login accounts, roles; owner of each transaction</w:t>
             </w:r>
           </w:p>
         </w:tc>
@@ -4450,7 +4617,7 @@
                 <w:sz w:val="20"/>
                 <w:szCs w:val="20"/>
               </w:rPr>
-              <w:t>supplier_id (NN)</w:t>
+              <w:t xml:space="preserve">supplier_id (NN), user_id (NN)</w:t>
             </w:r>
           </w:p>
         </w:tc>
@@ -4803,7 +4970,7 @@
                 <w:sz w:val="20"/>
                 <w:szCs w:val="20"/>
               </w:rPr>
-              <w:t>customer_id</w:t>
+              <w:t xml:space="preserve">customer_id, user_id (NN)</w:t>
             </w:r>
           </w:p>
         </w:tc>
@@ -5271,7 +5438,7 @@
                 <w:sz w:val="20"/>
                 <w:szCs w:val="20"/>
               </w:rPr>
-              <w:t>—</w:t>
+              <w:t xml:space="preserve">user_id (NN)</w:t>
             </w:r>
           </w:p>
         </w:tc>
@@ -5910,6 +6077,119 @@
                 <w:sz w:val="20"/>
                 <w:szCs w:val="20"/>
               </w:rPr>
+              <w:t xml:space="preserve">email</w:t>
+            </w:r>
+          </w:p>
+        </w:tc>
+        <w:tc>
+          <w:tcPr>
+            <w:tcW w:w="2300" w:type="dxa"/>
+            <w:tcBorders>
+              <w:top w:val="single" w:sz="4" w:space="0" w:color="BFBFBF"/>
+              <w:left w:val="single" w:sz="4" w:space="0" w:color="BFBFBF"/>
+              <w:bottom w:val="single" w:sz="4" w:space="0" w:color="BFBFBF"/>
+              <w:right w:val="single" w:sz="4" w:space="0" w:color="BFBFBF"/>
+            </w:tcBorders>
+            <w:tcMar>
+              <w:top w:w="60" w:type="dxa"/>
+              <w:left w:w="100" w:type="dxa"/>
+              <w:bottom w:w="60" w:type="dxa"/>
+              <w:right w:w="100" w:type="dxa"/>
+            </w:tcMar>
+          </w:tcPr>
+          <w:p>
+            <w:r>
+              <w:rPr>
+                <w:rFonts w:cs="Calibri"/>
+                <w:sz w:val="20"/>
+                <w:szCs w:val="20"/>
+              </w:rPr>
+              <w:t xml:space="preserve">varchar(100)</w:t>
+            </w:r>
+          </w:p>
+        </w:tc>
+        <w:tc>
+          <w:tcPr>
+            <w:tcW w:w="900" w:type="dxa"/>
+            <w:tcBorders>
+              <w:top w:val="single" w:sz="4" w:space="0" w:color="BFBFBF"/>
+              <w:left w:val="single" w:sz="4" w:space="0" w:color="BFBFBF"/>
+              <w:bottom w:val="single" w:sz="4" w:space="0" w:color="BFBFBF"/>
+              <w:right w:val="single" w:sz="4" w:space="0" w:color="BFBFBF"/>
+            </w:tcBorders>
+            <w:tcMar>
+              <w:top w:w="60" w:type="dxa"/>
+              <w:left w:w="100" w:type="dxa"/>
+              <w:bottom w:w="60" w:type="dxa"/>
+              <w:right w:w="100" w:type="dxa"/>
+            </w:tcMar>
+          </w:tcPr>
+          <w:p>
+            <w:r>
+              <w:rPr>
+                <w:rFonts w:cs="Calibri"/>
+                <w:sz w:val="20"/>
+                <w:szCs w:val="20"/>
+              </w:rPr>
+              <w:t xml:space="preserve"/>
+            </w:r>
+          </w:p>
+        </w:tc>
+        <w:tc>
+          <w:tcPr>
+            <w:tcW w:w="3726" w:type="dxa"/>
+            <w:tcBorders>
+              <w:top w:val="single" w:sz="4" w:space="0" w:color="BFBFBF"/>
+              <w:left w:val="single" w:sz="4" w:space="0" w:color="BFBFBF"/>
+              <w:bottom w:val="single" w:sz="4" w:space="0" w:color="BFBFBF"/>
+              <w:right w:val="single" w:sz="4" w:space="0" w:color="BFBFBF"/>
+            </w:tcBorders>
+            <w:tcMar>
+              <w:top w:w="60" w:type="dxa"/>
+              <w:left w:w="100" w:type="dxa"/>
+              <w:bottom w:w="60" w:type="dxa"/>
+              <w:right w:w="100" w:type="dxa"/>
+            </w:tcMar>
+          </w:tcPr>
+          <w:p>
+            <w:r>
+              <w:rPr>
+                <w:rFonts w:cs="Calibri"/>
+                <w:sz w:val="20"/>
+                <w:szCs w:val="20"/>
+              </w:rPr>
+              <w:t xml:space="preserve">nullable; where the password-reset code is e-mailed</w:t>
+            </w:r>
+          </w:p>
+        </w:tc>
+      </w:tr>
+      <w:tr>
+        <w:trPr>
+          <w:cantSplit/>
+        </w:trPr>
+        <w:tc>
+          <w:tcPr>
+            <w:tcW w:w="2100" w:type="dxa"/>
+            <w:tcBorders>
+              <w:top w:val="single" w:sz="4" w:space="0" w:color="BFBFBF"/>
+              <w:left w:val="single" w:sz="4" w:space="0" w:color="BFBFBF"/>
+              <w:bottom w:val="single" w:sz="4" w:space="0" w:color="BFBFBF"/>
+              <w:right w:val="single" w:sz="4" w:space="0" w:color="BFBFBF"/>
+            </w:tcBorders>
+            <w:tcMar>
+              <w:top w:w="60" w:type="dxa"/>
+              <w:left w:w="100" w:type="dxa"/>
+              <w:bottom w:w="60" w:type="dxa"/>
+              <w:right w:w="100" w:type="dxa"/>
+            </w:tcMar>
+          </w:tcPr>
+          <w:p>
+            <w:r>
+              <w:rPr>
+                <w:rFonts w:cs="Calibri"/>
+                <w:sz w:val="20"/>
+                <w:szCs w:val="20"/>
+              </w:rPr>
               <w:t>role</w:t>
             </w:r>
           </w:p>
@@ -5983,6 +6263,119 @@
                 <w:szCs w:val="20"/>
               </w:rPr>
               <w:t>NOT NULL, DEFAULT 'admin'</w:t>
+            </w:r>
+          </w:p>
+        </w:tc>
+      </w:tr>
+      <w:tr>
+        <w:trPr>
+          <w:cantSplit/>
+        </w:trPr>
+        <w:tc>
+          <w:tcPr>
+            <w:tcW w:w="2100" w:type="dxa"/>
+            <w:tcBorders>
+              <w:top w:val="single" w:sz="4" w:space="0" w:color="BFBFBF"/>
+              <w:left w:val="single" w:sz="4" w:space="0" w:color="BFBFBF"/>
+              <w:bottom w:val="single" w:sz="4" w:space="0" w:color="BFBFBF"/>
+              <w:right w:val="single" w:sz="4" w:space="0" w:color="BFBFBF"/>
+            </w:tcBorders>
+            <w:tcMar>
+              <w:top w:w="60" w:type="dxa"/>
+              <w:left w:w="100" w:type="dxa"/>
+              <w:bottom w:w="60" w:type="dxa"/>
+              <w:right w:w="100" w:type="dxa"/>
+            </w:tcMar>
+          </w:tcPr>
+          <w:p>
+            <w:r>
+              <w:rPr>
+                <w:rFonts w:cs="Calibri"/>
+                <w:sz w:val="20"/>
+                <w:szCs w:val="20"/>
+              </w:rPr>
+              <w:t xml:space="preserve">is_active</w:t>
+            </w:r>
+          </w:p>
+        </w:tc>
+        <w:tc>
+          <w:tcPr>
+            <w:tcW w:w="2300" w:type="dxa"/>
+            <w:tcBorders>
+              <w:top w:val="single" w:sz="4" w:space="0" w:color="BFBFBF"/>
+              <w:left w:val="single" w:sz="4" w:space="0" w:color="BFBFBF"/>
+              <w:bottom w:val="single" w:sz="4" w:space="0" w:color="BFBFBF"/>
+              <w:right w:val="single" w:sz="4" w:space="0" w:color="BFBFBF"/>
+            </w:tcBorders>
+            <w:tcMar>
+              <w:top w:w="60" w:type="dxa"/>
+              <w:left w:w="100" w:type="dxa"/>
+              <w:bottom w:w="60" w:type="dxa"/>
+              <w:right w:w="100" w:type="dxa"/>
+            </w:tcMar>
+          </w:tcPr>
+          <w:p>
+            <w:r>
+              <w:rPr>
+                <w:rFonts w:cs="Calibri"/>
+                <w:sz w:val="20"/>
+                <w:szCs w:val="20"/>
+              </w:rPr>
+              <w:t xml:space="preserve">tinyint(1)</w:t>
+            </w:r>
+          </w:p>
+        </w:tc>
+        <w:tc>
+          <w:tcPr>
+            <w:tcW w:w="900" w:type="dxa"/>
+            <w:tcBorders>
+              <w:top w:val="single" w:sz="4" w:space="0" w:color="BFBFBF"/>
+              <w:left w:val="single" w:sz="4" w:space="0" w:color="BFBFBF"/>
+              <w:bottom w:val="single" w:sz="4" w:space="0" w:color="BFBFBF"/>
+              <w:right w:val="single" w:sz="4" w:space="0" w:color="BFBFBF"/>
+            </w:tcBorders>
+            <w:tcMar>
+              <w:top w:w="60" w:type="dxa"/>
+              <w:left w:w="100" w:type="dxa"/>
+              <w:bottom w:w="60" w:type="dxa"/>
+              <w:right w:w="100" w:type="dxa"/>
+            </w:tcMar>
+          </w:tcPr>
+          <w:p>
+            <w:r>
+              <w:rPr>
+                <w:rFonts w:cs="Calibri"/>
+                <w:sz w:val="20"/>
+                <w:szCs w:val="20"/>
+              </w:rPr>
+              <w:t xml:space="preserve"/>
+            </w:r>
+          </w:p>
+        </w:tc>
+        <w:tc>
+          <w:tcPr>
+            <w:tcW w:w="3726" w:type="dxa"/>
+            <w:tcBorders>
+              <w:top w:val="single" w:sz="4" w:space="0" w:color="BFBFBF"/>
+              <w:left w:val="single" w:sz="4" w:space="0" w:color="BFBFBF"/>
+              <w:bottom w:val="single" w:sz="4" w:space="0" w:color="BFBFBF"/>
+              <w:right w:val="single" w:sz="4" w:space="0" w:color="BFBFBF"/>
+            </w:tcBorders>
+            <w:tcMar>
+              <w:top w:w="60" w:type="dxa"/>
+              <w:left w:w="100" w:type="dxa"/>
+              <w:bottom w:w="60" w:type="dxa"/>
+              <w:right w:w="100" w:type="dxa"/>
+            </w:tcMar>
+          </w:tcPr>
+          <w:p>
+            <w:r>
+              <w:rPr>
+                <w:rFonts w:cs="Calibri"/>
+                <w:sz w:val="20"/>
+                <w:szCs w:val="20"/>
+              </w:rPr>
+              <w:t xml:space="preserve">NOT NULL, DEFAULT 1 (0 = deactivated)</w:t>
             </w:r>
           </w:p>
         </w:tc>
@@ -10225,6 +10618,119 @@
                 <w:sz w:val="20"/>
                 <w:szCs w:val="20"/>
               </w:rPr>
+              <w:t xml:space="preserve">user_id</w:t>
+            </w:r>
+          </w:p>
+        </w:tc>
+        <w:tc>
+          <w:tcPr>
+            <w:tcW w:w="2300" w:type="dxa"/>
+            <w:tcBorders>
+              <w:top w:val="single" w:sz="4" w:space="0" w:color="BFBFBF"/>
+              <w:left w:val="single" w:sz="4" w:space="0" w:color="BFBFBF"/>
+              <w:bottom w:val="single" w:sz="4" w:space="0" w:color="BFBFBF"/>
+              <w:right w:val="single" w:sz="4" w:space="0" w:color="BFBFBF"/>
+            </w:tcBorders>
+            <w:tcMar>
+              <w:top w:w="60" w:type="dxa"/>
+              <w:left w:w="100" w:type="dxa"/>
+              <w:bottom w:w="60" w:type="dxa"/>
+              <w:right w:w="100" w:type="dxa"/>
+            </w:tcMar>
+          </w:tcPr>
+          <w:p>
+            <w:r>
+              <w:rPr>
+                <w:rFonts w:cs="Calibri"/>
+                <w:sz w:val="20"/>
+                <w:szCs w:val="20"/>
+              </w:rPr>
+              <w:t xml:space="preserve">int</w:t>
+            </w:r>
+          </w:p>
+        </w:tc>
+        <w:tc>
+          <w:tcPr>
+            <w:tcW w:w="900" w:type="dxa"/>
+            <w:tcBorders>
+              <w:top w:val="single" w:sz="4" w:space="0" w:color="BFBFBF"/>
+              <w:left w:val="single" w:sz="4" w:space="0" w:color="BFBFBF"/>
+              <w:bottom w:val="single" w:sz="4" w:space="0" w:color="BFBFBF"/>
+              <w:right w:val="single" w:sz="4" w:space="0" w:color="BFBFBF"/>
+            </w:tcBorders>
+            <w:tcMar>
+              <w:top w:w="60" w:type="dxa"/>
+              <w:left w:w="100" w:type="dxa"/>
+              <w:bottom w:w="60" w:type="dxa"/>
+              <w:right w:w="100" w:type="dxa"/>
+            </w:tcMar>
+          </w:tcPr>
+          <w:p>
+            <w:r>
+              <w:rPr>
+                <w:rFonts w:cs="Calibri"/>
+                <w:sz w:val="20"/>
+                <w:szCs w:val="20"/>
+              </w:rPr>
+              <w:t xml:space="preserve">FK</w:t>
+            </w:r>
+          </w:p>
+        </w:tc>
+        <w:tc>
+          <w:tcPr>
+            <w:tcW w:w="3726" w:type="dxa"/>
+            <w:tcBorders>
+              <w:top w:val="single" w:sz="4" w:space="0" w:color="BFBFBF"/>
+              <w:left w:val="single" w:sz="4" w:space="0" w:color="BFBFBF"/>
+              <w:bottom w:val="single" w:sz="4" w:space="0" w:color="BFBFBF"/>
+              <w:right w:val="single" w:sz="4" w:space="0" w:color="BFBFBF"/>
+            </w:tcBorders>
+            <w:tcMar>
+              <w:top w:w="60" w:type="dxa"/>
+              <w:left w:w="100" w:type="dxa"/>
+              <w:bottom w:w="60" w:type="dxa"/>
+              <w:right w:w="100" w:type="dxa"/>
+            </w:tcMar>
+          </w:tcPr>
+          <w:p>
+            <w:r>
+              <w:rPr>
+                <w:rFonts w:cs="Calibri"/>
+                <w:sz w:val="20"/>
+                <w:szCs w:val="20"/>
+              </w:rPr>
+              <w:t xml:space="preserve">NOT NULL → app_user (RESTRICT)</w:t>
+            </w:r>
+          </w:p>
+        </w:tc>
+      </w:tr>
+      <w:tr>
+        <w:trPr>
+          <w:cantSplit/>
+        </w:trPr>
+        <w:tc>
+          <w:tcPr>
+            <w:tcW w:w="2100" w:type="dxa"/>
+            <w:tcBorders>
+              <w:top w:val="single" w:sz="4" w:space="0" w:color="BFBFBF"/>
+              <w:left w:val="single" w:sz="4" w:space="0" w:color="BFBFBF"/>
+              <w:bottom w:val="single" w:sz="4" w:space="0" w:color="BFBFBF"/>
+              <w:right w:val="single" w:sz="4" w:space="0" w:color="BFBFBF"/>
+            </w:tcBorders>
+            <w:tcMar>
+              <w:top w:w="60" w:type="dxa"/>
+              <w:left w:w="100" w:type="dxa"/>
+              <w:bottom w:w="60" w:type="dxa"/>
+              <w:right w:w="100" w:type="dxa"/>
+            </w:tcMar>
+          </w:tcPr>
+          <w:p>
+            <w:r>
+              <w:rPr>
+                <w:rFonts w:cs="Calibri"/>
+                <w:sz w:val="20"/>
+                <w:szCs w:val="20"/>
+              </w:rPr>
               <w:t>purchase_date</w:t>
             </w:r>
           </w:p>
@@ -12578,6 +13084,119 @@
                 <w:sz w:val="20"/>
                 <w:szCs w:val="20"/>
               </w:rPr>
+              <w:t xml:space="preserve">user_id</w:t>
+            </w:r>
+          </w:p>
+        </w:tc>
+        <w:tc>
+          <w:tcPr>
+            <w:tcW w:w="2300" w:type="dxa"/>
+            <w:tcBorders>
+              <w:top w:val="single" w:sz="4" w:space="0" w:color="BFBFBF"/>
+              <w:left w:val="single" w:sz="4" w:space="0" w:color="BFBFBF"/>
+              <w:bottom w:val="single" w:sz="4" w:space="0" w:color="BFBFBF"/>
+              <w:right w:val="single" w:sz="4" w:space="0" w:color="BFBFBF"/>
+            </w:tcBorders>
+            <w:tcMar>
+              <w:top w:w="60" w:type="dxa"/>
+              <w:left w:w="100" w:type="dxa"/>
+              <w:bottom w:w="60" w:type="dxa"/>
+              <w:right w:w="100" w:type="dxa"/>
+            </w:tcMar>
+          </w:tcPr>
+          <w:p>
+            <w:r>
+              <w:rPr>
+                <w:rFonts w:cs="Calibri"/>
+                <w:sz w:val="20"/>
+                <w:szCs w:val="20"/>
+              </w:rPr>
+              <w:t xml:space="preserve">int</w:t>
+            </w:r>
+          </w:p>
+        </w:tc>
+        <w:tc>
+          <w:tcPr>
+            <w:tcW w:w="900" w:type="dxa"/>
+            <w:tcBorders>
+              <w:top w:val="single" w:sz="4" w:space="0" w:color="BFBFBF"/>
+              <w:left w:val="single" w:sz="4" w:space="0" w:color="BFBFBF"/>
+              <w:bottom w:val="single" w:sz="4" w:space="0" w:color="BFBFBF"/>
+              <w:right w:val="single" w:sz="4" w:space="0" w:color="BFBFBF"/>
+            </w:tcBorders>
+            <w:tcMar>
+              <w:top w:w="60" w:type="dxa"/>
+              <w:left w:w="100" w:type="dxa"/>
+              <w:bottom w:w="60" w:type="dxa"/>
+              <w:right w:w="100" w:type="dxa"/>
+            </w:tcMar>
+          </w:tcPr>
+          <w:p>
+            <w:r>
+              <w:rPr>
+                <w:rFonts w:cs="Calibri"/>
+                <w:sz w:val="20"/>
+                <w:szCs w:val="20"/>
+              </w:rPr>
+              <w:t xml:space="preserve">FK</w:t>
+            </w:r>
+          </w:p>
+        </w:tc>
+        <w:tc>
+          <w:tcPr>
+            <w:tcW w:w="3726" w:type="dxa"/>
+            <w:tcBorders>
+              <w:top w:val="single" w:sz="4" w:space="0" w:color="BFBFBF"/>
+              <w:left w:val="single" w:sz="4" w:space="0" w:color="BFBFBF"/>
+              <w:bottom w:val="single" w:sz="4" w:space="0" w:color="BFBFBF"/>
+              <w:right w:val="single" w:sz="4" w:space="0" w:color="BFBFBF"/>
+            </w:tcBorders>
+            <w:tcMar>
+              <w:top w:w="60" w:type="dxa"/>
+              <w:left w:w="100" w:type="dxa"/>
+              <w:bottom w:w="60" w:type="dxa"/>
+              <w:right w:w="100" w:type="dxa"/>
+            </w:tcMar>
+          </w:tcPr>
+          <w:p>
+            <w:r>
+              <w:rPr>
+                <w:rFonts w:cs="Calibri"/>
+                <w:sz w:val="20"/>
+                <w:szCs w:val="20"/>
+              </w:rPr>
+              <w:t xml:space="preserve">NOT NULL → app_user (RESTRICT)</w:t>
+            </w:r>
+          </w:p>
+        </w:tc>
+      </w:tr>
+      <w:tr>
+        <w:trPr>
+          <w:cantSplit/>
+        </w:trPr>
+        <w:tc>
+          <w:tcPr>
+            <w:tcW w:w="2100" w:type="dxa"/>
+            <w:tcBorders>
+              <w:top w:val="single" w:sz="4" w:space="0" w:color="BFBFBF"/>
+              <w:left w:val="single" w:sz="4" w:space="0" w:color="BFBFBF"/>
+              <w:bottom w:val="single" w:sz="4" w:space="0" w:color="BFBFBF"/>
+              <w:right w:val="single" w:sz="4" w:space="0" w:color="BFBFBF"/>
+            </w:tcBorders>
+            <w:tcMar>
+              <w:top w:w="60" w:type="dxa"/>
+              <w:left w:w="100" w:type="dxa"/>
+              <w:bottom w:w="60" w:type="dxa"/>
+              <w:right w:w="100" w:type="dxa"/>
+            </w:tcMar>
+          </w:tcPr>
+          <w:p>
+            <w:r>
+              <w:rPr>
+                <w:rFonts w:cs="Calibri"/>
+                <w:sz w:val="20"/>
+                <w:szCs w:val="20"/>
+              </w:rPr>
               <w:t>discount</w:t>
             </w:r>
           </w:p>
@@ -14956,6 +15575,119 @@
                 <w:szCs w:val="20"/>
               </w:rPr>
               <w:t>AUTO_INCREMENT</w:t>
+            </w:r>
+          </w:p>
+        </w:tc>
+      </w:tr>
+      <w:tr>
+        <w:trPr>
+          <w:cantSplit/>
+        </w:trPr>
+        <w:tc>
+          <w:tcPr>
+            <w:tcW w:w="2100" w:type="dxa"/>
+            <w:tcBorders>
+              <w:top w:val="single" w:sz="4" w:space="0" w:color="BFBFBF"/>
+              <w:left w:val="single" w:sz="4" w:space="0" w:color="BFBFBF"/>
+              <w:bottom w:val="single" w:sz="4" w:space="0" w:color="BFBFBF"/>
+              <w:right w:val="single" w:sz="4" w:space="0" w:color="BFBFBF"/>
+            </w:tcBorders>
+            <w:tcMar>
+              <w:top w:w="60" w:type="dxa"/>
+              <w:left w:w="100" w:type="dxa"/>
+              <w:bottom w:w="60" w:type="dxa"/>
+              <w:right w:w="100" w:type="dxa"/>
+            </w:tcMar>
+          </w:tcPr>
+          <w:p>
+            <w:r>
+              <w:rPr>
+                <w:rFonts w:cs="Calibri"/>
+                <w:sz w:val="20"/>
+                <w:szCs w:val="20"/>
+              </w:rPr>
+              <w:t xml:space="preserve">user_id</w:t>
+            </w:r>
+          </w:p>
+        </w:tc>
+        <w:tc>
+          <w:tcPr>
+            <w:tcW w:w="2300" w:type="dxa"/>
+            <w:tcBorders>
+              <w:top w:val="single" w:sz="4" w:space="0" w:color="BFBFBF"/>
+              <w:left w:val="single" w:sz="4" w:space="0" w:color="BFBFBF"/>
+              <w:bottom w:val="single" w:sz="4" w:space="0" w:color="BFBFBF"/>
+              <w:right w:val="single" w:sz="4" w:space="0" w:color="BFBFBF"/>
+            </w:tcBorders>
+            <w:tcMar>
+              <w:top w:w="60" w:type="dxa"/>
+              <w:left w:w="100" w:type="dxa"/>
+              <w:bottom w:w="60" w:type="dxa"/>
+              <w:right w:w="100" w:type="dxa"/>
+            </w:tcMar>
+          </w:tcPr>
+          <w:p>
+            <w:r>
+              <w:rPr>
+                <w:rFonts w:cs="Calibri"/>
+                <w:sz w:val="20"/>
+                <w:szCs w:val="20"/>
+              </w:rPr>
+              <w:t xml:space="preserve">int</w:t>
+            </w:r>
+          </w:p>
+        </w:tc>
+        <w:tc>
+          <w:tcPr>
+            <w:tcW w:w="900" w:type="dxa"/>
+            <w:tcBorders>
+              <w:top w:val="single" w:sz="4" w:space="0" w:color="BFBFBF"/>
+              <w:left w:val="single" w:sz="4" w:space="0" w:color="BFBFBF"/>
+              <w:bottom w:val="single" w:sz="4" w:space="0" w:color="BFBFBF"/>
+              <w:right w:val="single" w:sz="4" w:space="0" w:color="BFBFBF"/>
+            </w:tcBorders>
+            <w:tcMar>
+              <w:top w:w="60" w:type="dxa"/>
+              <w:left w:w="100" w:type="dxa"/>
+              <w:bottom w:w="60" w:type="dxa"/>
+              <w:right w:w="100" w:type="dxa"/>
+            </w:tcMar>
+          </w:tcPr>
+          <w:p>
+            <w:r>
+              <w:rPr>
+                <w:rFonts w:cs="Calibri"/>
+                <w:sz w:val="20"/>
+                <w:szCs w:val="20"/>
+              </w:rPr>
+              <w:t xml:space="preserve">FK</w:t>
+            </w:r>
+          </w:p>
+        </w:tc>
+        <w:tc>
+          <w:tcPr>
+            <w:tcW w:w="3726" w:type="dxa"/>
+            <w:tcBorders>
+              <w:top w:val="single" w:sz="4" w:space="0" w:color="BFBFBF"/>
+              <w:left w:val="single" w:sz="4" w:space="0" w:color="BFBFBF"/>
+              <w:bottom w:val="single" w:sz="4" w:space="0" w:color="BFBFBF"/>
+              <w:right w:val="single" w:sz="4" w:space="0" w:color="BFBFBF"/>
+            </w:tcBorders>
+            <w:tcMar>
+              <w:top w:w="60" w:type="dxa"/>
+              <w:left w:w="100" w:type="dxa"/>
+              <w:bottom w:w="60" w:type="dxa"/>
+              <w:right w:w="100" w:type="dxa"/>
+            </w:tcMar>
+          </w:tcPr>
+          <w:p>
+            <w:r>
+              <w:rPr>
+                <w:rFonts w:cs="Calibri"/>
+                <w:sz w:val="20"/>
+                <w:szCs w:val="20"/>
+              </w:rPr>
+              <w:t xml:space="preserve">NOT NULL → app_user (RESTRICT)</w:t>
             </w:r>
           </w:p>
         </w:tc>
@@ -16662,7 +17394,7 @@
         <w:spacing w:after="60"/>
       </w:pPr>
       <w:r>
-        <w:t>Insert the purchase header (supplier, date).</w:t>
+        <w:t xml:space="preserve">Insert the purchase header (supplier, logged-in user, date).</w:t>
       </w:r>
     </w:p>
     <w:p>
@@ -16715,7 +17447,7 @@
         <w:spacing w:after="60"/>
       </w:pPr>
       <w:r>
-        <w:t>Insert the sale header (customer or walk-in, discount).</w:t>
+        <w:t xml:space="preserve">Insert the sale header (customer or walk-in, logged-in user, discount).</w:t>
       </w:r>
     </w:p>
     <w:p>
@@ -16765,7 +17497,7 @@
         <w:rPr>
           <w:rFonts w:cs="Calibri"/>
         </w:rPr>
-        <w:t>Stock, average cost and expiry therefore always come from the lots, and the expiry warning looks at lots, not at a single date per product.</w:t>
+        <w:t xml:space="preserve">Stock, average cost and expiry therefore always come from the lots, and the expiry warning looks at lots, not at a single date per product. The user_id of every header row always comes from the login session on the server, never from a form field, so a user cannot record a bill under someone else's name.</w:t>
       </w:r>
     </w:p>
     <w:p>
@@ -17343,6 +18075,128 @@
                 <w:szCs w:val="20"/>
               </w:rPr>
               <w:t>customer.area added for area-wise sales reports; contact_person, email and barcode re-added as optional fields.</w:t>
+            </w:r>
+          </w:p>
+        </w:tc>
+      </w:tr>
+      <w:tr>
+        <w:trPr>
+          <w:cantSplit/>
+        </w:trPr>
+        <w:tc>
+          <w:tcPr>
+            <w:tcW w:w="3300" w:type="dxa"/>
+            <w:tcBorders>
+              <w:top w:val="single" w:sz="4" w:space="0" w:color="BFBFBF"/>
+              <w:left w:val="single" w:sz="4" w:space="0" w:color="BFBFBF"/>
+              <w:bottom w:val="single" w:sz="4" w:space="0" w:color="BFBFBF"/>
+              <w:right w:val="single" w:sz="4" w:space="0" w:color="BFBFBF"/>
+            </w:tcBorders>
+            <w:shd w:val="clear" w:color="auto" w:fill="F3F7F5"/>
+            <w:tcMar>
+              <w:top w:w="60" w:type="dxa"/>
+              <w:left w:w="100" w:type="dxa"/>
+              <w:bottom w:w="60" w:type="dxa"/>
+              <w:right w:w="100" w:type="dxa"/>
+            </w:tcMar>
+          </w:tcPr>
+          <w:p>
+            <w:r>
+              <w:rPr>
+                <w:rFonts w:cs="Calibri"/>
+                <w:sz w:val="20"/>
+                <w:szCs w:val="20"/>
+              </w:rPr>
+              <w:t xml:space="preserve">No record of who entered a transaction</w:t>
+            </w:r>
+          </w:p>
+        </w:tc>
+        <w:tc>
+          <w:tcPr>
+            <w:tcW w:w="5726" w:type="dxa"/>
+            <w:tcBorders>
+              <w:top w:val="single" w:sz="4" w:space="0" w:color="BFBFBF"/>
+              <w:left w:val="single" w:sz="4" w:space="0" w:color="BFBFBF"/>
+              <w:bottom w:val="single" w:sz="4" w:space="0" w:color="BFBFBF"/>
+              <w:right w:val="single" w:sz="4" w:space="0" w:color="BFBFBF"/>
+            </w:tcBorders>
+            <w:shd w:val="clear" w:color="auto" w:fill="F3F7F5"/>
+            <w:tcMar>
+              <w:top w:w="60" w:type="dxa"/>
+              <w:left w:w="100" w:type="dxa"/>
+              <w:bottom w:w="60" w:type="dxa"/>
+              <w:right w:w="100" w:type="dxa"/>
+            </w:tcMar>
+          </w:tcPr>
+          <w:p>
+            <w:r>
+              <w:rPr>
+                <w:rFonts w:cs="Calibri"/>
+                <w:sz w:val="20"/>
+                <w:szCs w:val="20"/>
+              </w:rPr>
+              <w:t xml:space="preserve">user_id added to sale, purchase and expense (app_user 1 : N each), filled from the login session. Detail rows, payments and lots reach the user through their header, so nothing is copied.</w:t>
+            </w:r>
+          </w:p>
+        </w:tc>
+      </w:tr>
+      <w:tr>
+        <w:trPr>
+          <w:cantSplit/>
+        </w:trPr>
+        <w:tc>
+          <w:tcPr>
+            <w:tcW w:w="3300" w:type="dxa"/>
+            <w:tcBorders>
+              <w:top w:val="single" w:sz="4" w:space="0" w:color="BFBFBF"/>
+              <w:left w:val="single" w:sz="4" w:space="0" w:color="BFBFBF"/>
+              <w:bottom w:val="single" w:sz="4" w:space="0" w:color="BFBFBF"/>
+              <w:right w:val="single" w:sz="4" w:space="0" w:color="BFBFBF"/>
+            </w:tcBorders>
+            <w:shd w:val="clear" w:color="auto" w:fill="F3F7F5"/>
+            <w:tcMar>
+              <w:top w:w="60" w:type="dxa"/>
+              <w:left w:w="100" w:type="dxa"/>
+              <w:bottom w:w="60" w:type="dxa"/>
+              <w:right w:w="100" w:type="dxa"/>
+            </w:tcMar>
+          </w:tcPr>
+          <w:p>
+            <w:r>
+              <w:rPr>
+                <w:rFonts w:cs="Calibri"/>
+                <w:sz w:val="20"/>
+                <w:szCs w:val="20"/>
+              </w:rPr>
+              <w:t xml:space="preserve">app_user held only login fields</w:t>
+            </w:r>
+          </w:p>
+        </w:tc>
+        <w:tc>
+          <w:tcPr>
+            <w:tcW w:w="5726" w:type="dxa"/>
+            <w:tcBorders>
+              <w:top w:val="single" w:sz="4" w:space="0" w:color="BFBFBF"/>
+              <w:left w:val="single" w:sz="4" w:space="0" w:color="BFBFBF"/>
+              <w:bottom w:val="single" w:sz="4" w:space="0" w:color="BFBFBF"/>
+              <w:right w:val="single" w:sz="4" w:space="0" w:color="BFBFBF"/>
+            </w:tcBorders>
+            <w:shd w:val="clear" w:color="auto" w:fill="F3F7F5"/>
+            <w:tcMar>
+              <w:top w:w="60" w:type="dxa"/>
+              <w:left w:w="100" w:type="dxa"/>
+              <w:bottom w:w="60" w:type="dxa"/>
+              <w:right w:w="100" w:type="dxa"/>
+            </w:tcMar>
+          </w:tcPr>
+          <w:p>
+            <w:r>
+              <w:rPr>
+                <w:rFonts w:cs="Calibri"/>
+                <w:sz w:val="20"/>
+                <w:szCs w:val="20"/>
+              </w:rPr>
+              <w:t xml:space="preserve">email (for the password-reset code) and is_active added. A user with history is deactivated instead of deleted (ON DELETE RESTRICT), so old bills keep the real name.</w:t>
             </w:r>
           </w:p>
         </w:tc>
@@ -17711,6 +18565,514 @@
     </w:p>
     <w:p>
       <w:pPr>
+        <w:keepNext/>
+        <w:spacing w:before="120" w:after="40"/>
+      </w:pPr>
+      <w:r>
+        <w:rPr>
+          <w:rFonts w:cs="Calibri"/>
+          <w:b/>
+          <w:bCs/>
+        </w:rPr>
+        <w:t xml:space="preserve">Sales recorded by each user</w:t>
+      </w:r>
+    </w:p>
+    <w:p>
+      <w:pPr>
+        <w:keepLines/>
+        <w:shd w:val="clear" w:color="auto" w:fill="F2F2F2"/>
+        <w:ind w:left="120"/>
+      </w:pPr>
+      <w:r>
+        <w:rPr>
+          <w:rFonts w:ascii="Consolas" w:eastAsia="Consolas" w:hAnsi="Consolas" w:cs="Consolas"/>
+          <w:sz w:val="18"/>
+          <w:szCs w:val="18"/>
+        </w:rPr>
+        <w:t xml:space="preserve">SELECT u.full_name, u.role, COUNT(*) AS bills,</w:t>
+      </w:r>
+    </w:p>
+    <w:p>
+      <w:pPr>
+        <w:keepLines/>
+        <w:shd w:val="clear" w:color="auto" w:fill="F2F2F2"/>
+        <w:ind w:left="120"/>
+      </w:pPr>
+      <w:r>
+        <w:rPr>
+          <w:rFonts w:ascii="Consolas" w:eastAsia="Consolas" w:hAnsi="Consolas" w:cs="Consolas"/>
+          <w:sz w:val="18"/>
+          <w:szCs w:val="18"/>
+        </w:rPr>
+        <w:t xml:space="preserve">       SUM(b.total - b.discount) AS sales</w:t>
+      </w:r>
+    </w:p>
+    <w:p>
+      <w:pPr>
+        <w:keepLines/>
+        <w:shd w:val="clear" w:color="auto" w:fill="F2F2F2"/>
+        <w:ind w:left="120"/>
+      </w:pPr>
+      <w:r>
+        <w:rPr>
+          <w:rFonts w:ascii="Consolas" w:eastAsia="Consolas" w:hAnsi="Consolas" w:cs="Consolas"/>
+          <w:sz w:val="18"/>
+          <w:szCs w:val="18"/>
+        </w:rPr>
+        <w:t xml:space="preserve">FROM app_user u</w:t>
+      </w:r>
+    </w:p>
+    <w:p>
+      <w:pPr>
+        <w:keepLines/>
+        <w:shd w:val="clear" w:color="auto" w:fill="F2F2F2"/>
+        <w:ind w:left="120"/>
+      </w:pPr>
+      <w:r>
+        <w:rPr>
+          <w:rFonts w:ascii="Consolas" w:eastAsia="Consolas" w:hAnsi="Consolas" w:cs="Consolas"/>
+          <w:sz w:val="18"/>
+          <w:szCs w:val="18"/>
+        </w:rPr>
+        <w:t xml:space="preserve">JOIN (SELECT s.sale_id, s.user_id, s.discount,</w:t>
+      </w:r>
+    </w:p>
+    <w:p>
+      <w:pPr>
+        <w:keepLines/>
+        <w:shd w:val="clear" w:color="auto" w:fill="F2F2F2"/>
+        <w:ind w:left="120"/>
+      </w:pPr>
+      <w:r>
+        <w:rPr>
+          <w:rFonts w:ascii="Consolas" w:eastAsia="Consolas" w:hAnsi="Consolas" w:cs="Consolas"/>
+          <w:sz w:val="18"/>
+          <w:szCs w:val="18"/>
+        </w:rPr>
+        <w:t xml:space="preserve">             SUM(d.quantity * d.unit_price) AS total</w:t>
+      </w:r>
+    </w:p>
+    <w:p>
+      <w:pPr>
+        <w:keepLines/>
+        <w:shd w:val="clear" w:color="auto" w:fill="F2F2F2"/>
+        <w:ind w:left="120"/>
+      </w:pPr>
+      <w:r>
+        <w:rPr>
+          <w:rFonts w:ascii="Consolas" w:eastAsia="Consolas" w:hAnsi="Consolas" w:cs="Consolas"/>
+          <w:sz w:val="18"/>
+          <w:szCs w:val="18"/>
+        </w:rPr>
+        <w:t xml:space="preserve">      FROM sale s</w:t>
+      </w:r>
+    </w:p>
+    <w:p>
+      <w:pPr>
+        <w:keepLines/>
+        <w:shd w:val="clear" w:color="auto" w:fill="F2F2F2"/>
+        <w:ind w:left="120"/>
+      </w:pPr>
+      <w:r>
+        <w:rPr>
+          <w:rFonts w:ascii="Consolas" w:eastAsia="Consolas" w:hAnsi="Consolas" w:cs="Consolas"/>
+          <w:sz w:val="18"/>
+          <w:szCs w:val="18"/>
+        </w:rPr>
+        <w:t xml:space="preserve">      JOIN sale_detail d ON d.sale_id = s.sale_id</w:t>
+      </w:r>
+    </w:p>
+    <w:p>
+      <w:pPr>
+        <w:keepLines/>
+        <w:shd w:val="clear" w:color="auto" w:fill="F2F2F2"/>
+        <w:ind w:left="120"/>
+      </w:pPr>
+      <w:r>
+        <w:rPr>
+          <w:rFonts w:ascii="Consolas" w:eastAsia="Consolas" w:hAnsi="Consolas" w:cs="Consolas"/>
+          <w:sz w:val="18"/>
+          <w:szCs w:val="18"/>
+        </w:rPr>
+        <w:t xml:space="preserve">      GROUP BY s.sale_id) b ON b.user_id = u.user_id</w:t>
+      </w:r>
+    </w:p>
+    <w:p>
+      <w:pPr>
+        <w:keepLines/>
+        <w:shd w:val="clear" w:color="auto" w:fill="F2F2F2"/>
+        <w:ind w:left="120"/>
+      </w:pPr>
+      <w:r>
+        <w:rPr>
+          <w:rFonts w:ascii="Consolas" w:eastAsia="Consolas" w:hAnsi="Consolas" w:cs="Consolas"/>
+          <w:sz w:val="18"/>
+          <w:szCs w:val="18"/>
+        </w:rPr>
+        <w:t xml:space="preserve">GROUP BY u.user_id, u.full_name, u.role;</w:t>
+      </w:r>
+    </w:p>
+    <w:p>
+      <w:pPr>
+        <w:pStyle w:val="Heading2"/>
+        <w:keepNext/>
+      </w:pPr>
+      <w:r>
+        <w:t xml:space="preserve">3.6 Supporting tables (not in the ER diagram)</w:t>
+      </w:r>
+    </w:p>
+    <w:p>
+      <w:pPr>
+        <w:spacing w:after="120" w:line="276" w:lineRule="auto"/>
+      </w:pPr>
+      <w:r>
+        <w:rPr>
+          <w:rFonts w:cs="Calibri"/>
+        </w:rPr>
+        <w:t xml:space="preserve">Besides the 14 tables of the ER diagram, database.sql creates four supporting tables for account security. They are not business entities, so they are not drawn in the ER diagram.</w:t>
+      </w:r>
+    </w:p>
+    <w:tbl>
+      <w:tblPr>
+        <w:tblW w:w="9026" w:type="dxa"/>
+        <w:tblBorders>
+          <w:top w:val="single" w:sz="4" w:space="0" w:color="auto"/>
+          <w:left w:val="single" w:sz="4" w:space="0" w:color="auto"/>
+          <w:bottom w:val="single" w:sz="4" w:space="0" w:color="auto"/>
+          <w:right w:val="single" w:sz="4" w:space="0" w:color="auto"/>
+          <w:insideH w:val="single" w:sz="4" w:space="0" w:color="auto"/>
+          <w:insideV w:val="single" w:sz="4" w:space="0" w:color="auto"/>
+        </w:tblBorders>
+        <w:tblCellMar>
+          <w:left w:w="10" w:type="dxa"/>
+          <w:right w:w="10" w:type="dxa"/>
+        </w:tblCellMar>
+        <w:tblLook w:val="0000" w:firstRow="0" w:lastRow="0" w:firstColumn="0" w:lastColumn="0" w:noHBand="0" w:noVBand="0"/>
+      </w:tblPr>
+      <w:tblGrid>
+        <w:gridCol w:w="3000"/>
+        <w:gridCol w:w="6026"/>
+      </w:tblGrid>
+      <w:tr>
+        <w:trPr>
+          <w:cantSplit/>
+          <w:tblHeader/>
+        </w:trPr>
+        <w:tc>
+          <w:tcPr>
+            <w:tcW w:w="3000" w:type="dxa"/>
+            <w:tcBorders>
+              <w:top w:val="single" w:sz="4" w:space="0" w:color="BFBFBF"/>
+              <w:left w:val="single" w:sz="4" w:space="0" w:color="BFBFBF"/>
+              <w:bottom w:val="single" w:sz="4" w:space="0" w:color="BFBFBF"/>
+              <w:right w:val="single" w:sz="4" w:space="0" w:color="BFBFBF"/>
+            </w:tcBorders>
+            <w:shd w:val="clear" w:color="auto" w:fill="16332A"/>
+            <w:tcMar>
+              <w:top w:w="60" w:type="dxa"/>
+              <w:left w:w="100" w:type="dxa"/>
+              <w:bottom w:w="60" w:type="dxa"/>
+              <w:right w:w="100" w:type="dxa"/>
+            </w:tcMar>
+          </w:tcPr>
+          <w:p>
+            <w:r>
+              <w:rPr>
+                <w:rFonts w:cs="Calibri"/>
+                <w:b/>
+                <w:bCs/>
+                <w:color w:val="FFFFFF"/>
+                <w:sz w:val="20"/>
+                <w:szCs w:val="20"/>
+              </w:rPr>
+              <w:t xml:space="preserve">Table</w:t>
+            </w:r>
+          </w:p>
+        </w:tc>
+        <w:tc>
+          <w:tcPr>
+            <w:tcW w:w="6026" w:type="dxa"/>
+            <w:tcBorders>
+              <w:top w:val="single" w:sz="4" w:space="0" w:color="BFBFBF"/>
+              <w:left w:val="single" w:sz="4" w:space="0" w:color="BFBFBF"/>
+              <w:bottom w:val="single" w:sz="4" w:space="0" w:color="BFBFBF"/>
+              <w:right w:val="single" w:sz="4" w:space="0" w:color="BFBFBF"/>
+            </w:tcBorders>
+            <w:shd w:val="clear" w:color="auto" w:fill="16332A"/>
+            <w:tcMar>
+              <w:top w:w="60" w:type="dxa"/>
+              <w:left w:w="100" w:type="dxa"/>
+              <w:bottom w:w="60" w:type="dxa"/>
+              <w:right w:w="100" w:type="dxa"/>
+            </w:tcMar>
+          </w:tcPr>
+          <w:p>
+            <w:r>
+              <w:rPr>
+                <w:rFonts w:cs="Calibri"/>
+                <w:b/>
+                <w:bCs/>
+                <w:color w:val="FFFFFF"/>
+                <w:sz w:val="20"/>
+                <w:szCs w:val="20"/>
+              </w:rPr>
+              <w:t xml:space="preserve">Purpose</w:t>
+            </w:r>
+          </w:p>
+        </w:tc>
+      </w:tr>
+      <w:tr>
+        <w:trPr>
+          <w:cantSplit/>
+        </w:trPr>
+        <w:tc>
+          <w:tcPr>
+            <w:tcW w:w="3000" w:type="dxa"/>
+            <w:tcBorders>
+              <w:top w:val="single" w:sz="4" w:space="0" w:color="BFBFBF"/>
+              <w:left w:val="single" w:sz="4" w:space="0" w:color="BFBFBF"/>
+              <w:bottom w:val="single" w:sz="4" w:space="0" w:color="BFBFBF"/>
+              <w:right w:val="single" w:sz="4" w:space="0" w:color="BFBFBF"/>
+            </w:tcBorders>
+            <w:tcMar>
+              <w:top w:w="60" w:type="dxa"/>
+              <w:left w:w="100" w:type="dxa"/>
+              <w:bottom w:w="60" w:type="dxa"/>
+              <w:right w:w="100" w:type="dxa"/>
+            </w:tcMar>
+          </w:tcPr>
+          <w:p>
+            <w:r>
+              <w:rPr>
+                <w:rFonts w:cs="Calibri"/>
+                <w:b/>
+                <w:bCs/>
+                <w:sz w:val="20"/>
+                <w:szCs w:val="20"/>
+              </w:rPr>
+              <w:t xml:space="preserve">staff_log</w:t>
+            </w:r>
+          </w:p>
+        </w:tc>
+        <w:tc>
+          <w:tcPr>
+            <w:tcW w:w="6026" w:type="dxa"/>
+            <w:tcBorders>
+              <w:top w:val="single" w:sz="4" w:space="0" w:color="BFBFBF"/>
+              <w:left w:val="single" w:sz="4" w:space="0" w:color="BFBFBF"/>
+              <w:bottom w:val="single" w:sz="4" w:space="0" w:color="BFBFBF"/>
+              <w:right w:val="single" w:sz="4" w:space="0" w:color="BFBFBF"/>
+            </w:tcBorders>
+            <w:tcMar>
+              <w:top w:w="60" w:type="dxa"/>
+              <w:left w:w="100" w:type="dxa"/>
+              <w:bottom w:w="60" w:type="dxa"/>
+              <w:right w:w="100" w:type="dxa"/>
+            </w:tcMar>
+          </w:tcPr>
+          <w:p>
+            <w:r>
+              <w:rPr>
+                <w:rFonts w:cs="Calibri"/>
+                <w:sz w:val="20"/>
+                <w:szCs w:val="20"/>
+              </w:rPr>
+              <w:t xml:space="preserve">Audit trail of account actions (hire, edit, deactivate, delete, password decisions): who did what to which account, and when. Names are stored as text with no foreign key, so the log survives account deletion.</w:t>
+            </w:r>
+          </w:p>
+        </w:tc>
+      </w:tr>
+      <w:tr>
+        <w:trPr>
+          <w:cantSplit/>
+        </w:trPr>
+        <w:tc>
+          <w:tcPr>
+            <w:tcW w:w="3000" w:type="dxa"/>
+            <w:tcBorders>
+              <w:top w:val="single" w:sz="4" w:space="0" w:color="BFBFBF"/>
+              <w:left w:val="single" w:sz="4" w:space="0" w:color="BFBFBF"/>
+              <w:bottom w:val="single" w:sz="4" w:space="0" w:color="BFBFBF"/>
+              <w:right w:val="single" w:sz="4" w:space="0" w:color="BFBFBF"/>
+            </w:tcBorders>
+            <w:tcMar>
+              <w:top w:w="60" w:type="dxa"/>
+              <w:left w:w="100" w:type="dxa"/>
+              <w:bottom w:w="60" w:type="dxa"/>
+              <w:right w:w="100" w:type="dxa"/>
+            </w:tcMar>
+          </w:tcPr>
+          <w:p>
+            <w:r>
+              <w:rPr>
+                <w:rFonts w:cs="Calibri"/>
+                <w:b/>
+                <w:bCs/>
+                <w:sz w:val="20"/>
+                <w:szCs w:val="20"/>
+              </w:rPr>
+              <w:t xml:space="preserve">login_attempt</w:t>
+            </w:r>
+          </w:p>
+        </w:tc>
+        <w:tc>
+          <w:tcPr>
+            <w:tcW w:w="6026" w:type="dxa"/>
+            <w:tcBorders>
+              <w:top w:val="single" w:sz="4" w:space="0" w:color="BFBFBF"/>
+              <w:left w:val="single" w:sz="4" w:space="0" w:color="BFBFBF"/>
+              <w:bottom w:val="single" w:sz="4" w:space="0" w:color="BFBFBF"/>
+              <w:right w:val="single" w:sz="4" w:space="0" w:color="BFBFBF"/>
+            </w:tcBorders>
+            <w:tcMar>
+              <w:top w:w="60" w:type="dxa"/>
+              <w:left w:w="100" w:type="dxa"/>
+              <w:bottom w:w="60" w:type="dxa"/>
+              <w:right w:w="100" w:type="dxa"/>
+            </w:tcMar>
+          </w:tcPr>
+          <w:p>
+            <w:r>
+              <w:rPr>
+                <w:rFonts w:cs="Calibri"/>
+                <w:sz w:val="20"/>
+                <w:szCs w:val="20"/>
+              </w:rPr>
+              <w:t xml:space="preserve">Failed sign-in log for the login lock: 5 wrong passwords for one username within 15 minutes lock that login until the window clears or an Owner / Manager unlocks it.</w:t>
+            </w:r>
+          </w:p>
+        </w:tc>
+      </w:tr>
+      <w:tr>
+        <w:trPr>
+          <w:cantSplit/>
+        </w:trPr>
+        <w:tc>
+          <w:tcPr>
+            <w:tcW w:w="3000" w:type="dxa"/>
+            <w:tcBorders>
+              <w:top w:val="single" w:sz="4" w:space="0" w:color="BFBFBF"/>
+              <w:left w:val="single" w:sz="4" w:space="0" w:color="BFBFBF"/>
+              <w:bottom w:val="single" w:sz="4" w:space="0" w:color="BFBFBF"/>
+              <w:right w:val="single" w:sz="4" w:space="0" w:color="BFBFBF"/>
+            </w:tcBorders>
+            <w:tcMar>
+              <w:top w:w="60" w:type="dxa"/>
+              <w:left w:w="100" w:type="dxa"/>
+              <w:bottom w:w="60" w:type="dxa"/>
+              <w:right w:w="100" w:type="dxa"/>
+            </w:tcMar>
+          </w:tcPr>
+          <w:p>
+            <w:r>
+              <w:rPr>
+                <w:rFonts w:cs="Calibri"/>
+                <w:b/>
+                <w:bCs/>
+                <w:sz w:val="20"/>
+                <w:szCs w:val="20"/>
+              </w:rPr>
+              <w:t xml:space="preserve">password_request</w:t>
+            </w:r>
+          </w:p>
+        </w:tc>
+        <w:tc>
+          <w:tcPr>
+            <w:tcW w:w="6026" w:type="dxa"/>
+            <w:tcBorders>
+              <w:top w:val="single" w:sz="4" w:space="0" w:color="BFBFBF"/>
+              <w:left w:val="single" w:sz="4" w:space="0" w:color="BFBFBF"/>
+              <w:bottom w:val="single" w:sz="4" w:space="0" w:color="BFBFBF"/>
+              <w:right w:val="single" w:sz="4" w:space="0" w:color="BFBFBF"/>
+            </w:tcBorders>
+            <w:tcMar>
+              <w:top w:w="60" w:type="dxa"/>
+              <w:left w:w="100" w:type="dxa"/>
+              <w:bottom w:w="60" w:type="dxa"/>
+              <w:right w:w="100" w:type="dxa"/>
+            </w:tcMar>
+          </w:tcPr>
+          <w:p>
+            <w:r>
+              <w:rPr>
+                <w:rFonts w:cs="Calibri"/>
+                <w:sz w:val="20"/>
+                <w:szCs w:val="20"/>
+              </w:rPr>
+              <w:t xml:space="preserve">A new password waiting for approval (only the bcrypt hash is stored). Cashier → Manager or Owner, Manager → Owner; the Owner applies immediately. user_id → app_user (CASCADE).</w:t>
+            </w:r>
+          </w:p>
+        </w:tc>
+      </w:tr>
+      <w:tr>
+        <w:trPr>
+          <w:cantSplit/>
+        </w:trPr>
+        <w:tc>
+          <w:tcPr>
+            <w:tcW w:w="3000" w:type="dxa"/>
+            <w:tcBorders>
+              <w:top w:val="single" w:sz="4" w:space="0" w:color="BFBFBF"/>
+              <w:left w:val="single" w:sz="4" w:space="0" w:color="BFBFBF"/>
+              <w:bottom w:val="single" w:sz="4" w:space="0" w:color="BFBFBF"/>
+              <w:right w:val="single" w:sz="4" w:space="0" w:color="BFBFBF"/>
+            </w:tcBorders>
+            <w:tcMar>
+              <w:top w:w="60" w:type="dxa"/>
+              <w:left w:w="100" w:type="dxa"/>
+              <w:bottom w:w="60" w:type="dxa"/>
+              <w:right w:w="100" w:type="dxa"/>
+            </w:tcMar>
+          </w:tcPr>
+          <w:p>
+            <w:r>
+              <w:rPr>
+                <w:rFonts w:cs="Calibri"/>
+                <w:b/>
+                <w:bCs/>
+                <w:sz w:val="20"/>
+                <w:szCs w:val="20"/>
+              </w:rPr>
+              <w:t xml:space="preserve">password_code</w:t>
+            </w:r>
+          </w:p>
+        </w:tc>
+        <w:tc>
+          <w:tcPr>
+            <w:tcW w:w="6026" w:type="dxa"/>
+            <w:tcBorders>
+              <w:top w:val="single" w:sz="4" w:space="0" w:color="BFBFBF"/>
+              <w:left w:val="single" w:sz="4" w:space="0" w:color="BFBFBF"/>
+              <w:bottom w:val="single" w:sz="4" w:space="0" w:color="BFBFBF"/>
+              <w:right w:val="single" w:sz="4" w:space="0" w:color="BFBFBF"/>
+            </w:tcBorders>
+            <w:tcMar>
+              <w:top w:w="60" w:type="dxa"/>
+              <w:left w:w="100" w:type="dxa"/>
+              <w:bottom w:w="60" w:type="dxa"/>
+              <w:right w:w="100" w:type="dxa"/>
+            </w:tcMar>
+          </w:tcPr>
+          <w:p>
+            <w:r>
+              <w:rPr>
+                <w:rFonts w:cs="Calibri"/>
+                <w:sz w:val="20"/>
+                <w:szCs w:val="20"/>
+              </w:rPr>
+              <w:t xml:space="preserve">Emailed 6-digit reset code, stored hashed; valid 10 minutes, 5 tries, single use. user_id → app_user (CASCADE).</w:t>
+            </w:r>
+          </w:p>
+        </w:tc>
+      </w:tr>
+    </w:tbl>
+    <w:p>
+      <w:pPr>
+        <w:spacing w:after="80"/>
+      </w:pPr>
+    </w:p>
+    <w:p>
+      <w:pPr>
         <w:pStyle w:val="Heading1"/>
         <w:keepNext/>
       </w:pPr>
@@ -17726,7 +19088,7 @@
         <w:rPr>
           <w:rFonts w:cs="Calibri"/>
         </w:rPr>
-        <w:t>Every form below maps to an entity, attribute set or relationship of the ER diagram. Foreign keys are chosen from dropdowns (never typed), money uses number inputs with step 0.01, dates use date inputs, and required fields are validated in the browser and again in PHP.</w:t>
+        <w:t xml:space="preserve">Every form below maps to an entity, attribute set or relationship of the ER diagram. Foreign keys are chosen from dropdowns (never typed), money uses number inputs with step 0.01, dates use date inputs, and required fields are validated in the browser and again in PHP. The user who records a sale, purchase or expense is never typed on a form: the server reads it from the login session.</w:t>
       </w:r>
     </w:p>
     <w:tbl>
@@ -19259,6 +20621,232 @@
                 <w:szCs w:val="20"/>
               </w:rPr>
               <w:t>Date + amount &gt; 0 required</w:t>
+            </w:r>
+          </w:p>
+        </w:tc>
+      </w:tr>
+      <w:tr>
+        <w:trPr>
+          <w:cantSplit/>
+        </w:trPr>
+        <w:tc>
+          <w:tcPr>
+            <w:tcW w:w="1900" w:type="dxa"/>
+            <w:tcBorders>
+              <w:top w:val="single" w:sz="4" w:space="0" w:color="BFBFBF"/>
+              <w:left w:val="single" w:sz="4" w:space="0" w:color="BFBFBF"/>
+              <w:bottom w:val="single" w:sz="4" w:space="0" w:color="BFBFBF"/>
+              <w:right w:val="single" w:sz="4" w:space="0" w:color="BFBFBF"/>
+            </w:tcBorders>
+            <w:tcMar>
+              <w:top w:w="60" w:type="dxa"/>
+              <w:left w:w="100" w:type="dxa"/>
+              <w:bottom w:w="60" w:type="dxa"/>
+              <w:right w:w="100" w:type="dxa"/>
+            </w:tcMar>
+          </w:tcPr>
+          <w:p>
+            <w:r>
+              <w:rPr>
+                <w:rFonts w:cs="Calibri"/>
+                <w:sz w:val="20"/>
+                <w:szCs w:val="20"/>
+              </w:rPr>
+              <w:t xml:space="preserve">Staff &amp; Access</w:t>
+            </w:r>
+          </w:p>
+        </w:tc>
+        <w:tc>
+          <w:tcPr>
+            <w:tcW w:w="1900" w:type="dxa"/>
+            <w:tcBorders>
+              <w:top w:val="single" w:sz="4" w:space="0" w:color="BFBFBF"/>
+              <w:left w:val="single" w:sz="4" w:space="0" w:color="BFBFBF"/>
+              <w:bottom w:val="single" w:sz="4" w:space="0" w:color="BFBFBF"/>
+              <w:right w:val="single" w:sz="4" w:space="0" w:color="BFBFBF"/>
+            </w:tcBorders>
+            <w:tcMar>
+              <w:top w:w="60" w:type="dxa"/>
+              <w:left w:w="100" w:type="dxa"/>
+              <w:bottom w:w="60" w:type="dxa"/>
+              <w:right w:w="100" w:type="dxa"/>
+            </w:tcMar>
+          </w:tcPr>
+          <w:p>
+            <w:r>
+              <w:rPr>
+                <w:rFonts w:cs="Calibri"/>
+                <w:sz w:val="20"/>
+                <w:szCs w:val="20"/>
+              </w:rPr>
+              <w:t xml:space="preserve">app_user, staff_log</w:t>
+            </w:r>
+          </w:p>
+        </w:tc>
+        <w:tc>
+          <w:tcPr>
+            <w:tcW w:w="2500" w:type="dxa"/>
+            <w:tcBorders>
+              <w:top w:val="single" w:sz="4" w:space="0" w:color="BFBFBF"/>
+              <w:left w:val="single" w:sz="4" w:space="0" w:color="BFBFBF"/>
+              <w:bottom w:val="single" w:sz="4" w:space="0" w:color="BFBFBF"/>
+              <w:right w:val="single" w:sz="4" w:space="0" w:color="BFBFBF"/>
+            </w:tcBorders>
+            <w:tcMar>
+              <w:top w:w="60" w:type="dxa"/>
+              <w:left w:w="100" w:type="dxa"/>
+              <w:bottom w:w="60" w:type="dxa"/>
+              <w:right w:w="100" w:type="dxa"/>
+            </w:tcMar>
+          </w:tcPr>
+          <w:p>
+            <w:r>
+              <w:rPr>
+                <w:rFonts w:cs="Calibri"/>
+                <w:sz w:val="20"/>
+                <w:szCs w:val="20"/>
+              </w:rPr>
+              <w:t xml:space="preserve">Text, e-mail, role select, active toggle</w:t>
+            </w:r>
+          </w:p>
+        </w:tc>
+        <w:tc>
+          <w:tcPr>
+            <w:tcW w:w="2726" w:type="dxa"/>
+            <w:tcBorders>
+              <w:top w:val="single" w:sz="4" w:space="0" w:color="BFBFBF"/>
+              <w:left w:val="single" w:sz="4" w:space="0" w:color="BFBFBF"/>
+              <w:bottom w:val="single" w:sz="4" w:space="0" w:color="BFBFBF"/>
+              <w:right w:val="single" w:sz="4" w:space="0" w:color="BFBFBF"/>
+            </w:tcBorders>
+            <w:tcMar>
+              <w:top w:w="60" w:type="dxa"/>
+              <w:left w:w="100" w:type="dxa"/>
+              <w:bottom w:w="60" w:type="dxa"/>
+              <w:right w:w="100" w:type="dxa"/>
+            </w:tcMar>
+          </w:tcPr>
+          <w:p>
+            <w:r>
+              <w:rPr>
+                <w:rFonts w:cs="Calibri"/>
+                <w:sz w:val="20"/>
+                <w:szCs w:val="20"/>
+              </w:rPr>
+              <w:t xml:space="preserve">Owner hires Cashier / Manager; Manager hires Cashier only; accounts with history are deactivated, not deleted</w:t>
+            </w:r>
+          </w:p>
+        </w:tc>
+      </w:tr>
+      <w:tr>
+        <w:trPr>
+          <w:cantSplit/>
+        </w:trPr>
+        <w:tc>
+          <w:tcPr>
+            <w:tcW w:w="1900" w:type="dxa"/>
+            <w:tcBorders>
+              <w:top w:val="single" w:sz="4" w:space="0" w:color="BFBFBF"/>
+              <w:left w:val="single" w:sz="4" w:space="0" w:color="BFBFBF"/>
+              <w:bottom w:val="single" w:sz="4" w:space="0" w:color="BFBFBF"/>
+              <w:right w:val="single" w:sz="4" w:space="0" w:color="BFBFBF"/>
+            </w:tcBorders>
+            <w:tcMar>
+              <w:top w:w="60" w:type="dxa"/>
+              <w:left w:w="100" w:type="dxa"/>
+              <w:bottom w:w="60" w:type="dxa"/>
+              <w:right w:w="100" w:type="dxa"/>
+            </w:tcMar>
+          </w:tcPr>
+          <w:p>
+            <w:r>
+              <w:rPr>
+                <w:rFonts w:cs="Calibri"/>
+                <w:sz w:val="20"/>
+                <w:szCs w:val="20"/>
+              </w:rPr>
+              <w:t xml:space="preserve">My Account</w:t>
+            </w:r>
+          </w:p>
+        </w:tc>
+        <w:tc>
+          <w:tcPr>
+            <w:tcW w:w="1900" w:type="dxa"/>
+            <w:tcBorders>
+              <w:top w:val="single" w:sz="4" w:space="0" w:color="BFBFBF"/>
+              <w:left w:val="single" w:sz="4" w:space="0" w:color="BFBFBF"/>
+              <w:bottom w:val="single" w:sz="4" w:space="0" w:color="BFBFBF"/>
+              <w:right w:val="single" w:sz="4" w:space="0" w:color="BFBFBF"/>
+            </w:tcBorders>
+            <w:tcMar>
+              <w:top w:w="60" w:type="dxa"/>
+              <w:left w:w="100" w:type="dxa"/>
+              <w:bottom w:w="60" w:type="dxa"/>
+              <w:right w:w="100" w:type="dxa"/>
+            </w:tcMar>
+          </w:tcPr>
+          <w:p>
+            <w:r>
+              <w:rPr>
+                <w:rFonts w:cs="Calibri"/>
+                <w:sz w:val="20"/>
+                <w:szCs w:val="20"/>
+              </w:rPr>
+              <w:t xml:space="preserve">app_user, password_request</w:t>
+            </w:r>
+          </w:p>
+        </w:tc>
+        <w:tc>
+          <w:tcPr>
+            <w:tcW w:w="2500" w:type="dxa"/>
+            <w:tcBorders>
+              <w:top w:val="single" w:sz="4" w:space="0" w:color="BFBFBF"/>
+              <w:left w:val="single" w:sz="4" w:space="0" w:color="BFBFBF"/>
+              <w:bottom w:val="single" w:sz="4" w:space="0" w:color="BFBFBF"/>
+              <w:right w:val="single" w:sz="4" w:space="0" w:color="BFBFBF"/>
+            </w:tcBorders>
+            <w:tcMar>
+              <w:top w:w="60" w:type="dxa"/>
+              <w:left w:w="100" w:type="dxa"/>
+              <w:bottom w:w="60" w:type="dxa"/>
+              <w:right w:w="100" w:type="dxa"/>
+            </w:tcMar>
+          </w:tcPr>
+          <w:p>
+            <w:r>
+              <w:rPr>
+                <w:rFonts w:cs="Calibri"/>
+                <w:sz w:val="20"/>
+                <w:szCs w:val="20"/>
+              </w:rPr>
+              <w:t xml:space="preserve">Current / new password</w:t>
+            </w:r>
+          </w:p>
+        </w:tc>
+        <w:tc>
+          <w:tcPr>
+            <w:tcW w:w="2726" w:type="dxa"/>
+            <w:tcBorders>
+              <w:top w:val="single" w:sz="4" w:space="0" w:color="BFBFBF"/>
+              <w:left w:val="single" w:sz="4" w:space="0" w:color="BFBFBF"/>
+              <w:bottom w:val="single" w:sz="4" w:space="0" w:color="BFBFBF"/>
+              <w:right w:val="single" w:sz="4" w:space="0" w:color="BFBFBF"/>
+            </w:tcBorders>
+            <w:tcMar>
+              <w:top w:w="60" w:type="dxa"/>
+              <w:left w:w="100" w:type="dxa"/>
+              <w:bottom w:w="60" w:type="dxa"/>
+              <w:right w:w="100" w:type="dxa"/>
+            </w:tcMar>
+          </w:tcPr>
+          <w:p>
+            <w:r>
+              <w:rPr>
+                <w:rFonts w:cs="Calibri"/>
+                <w:sz w:val="20"/>
+                <w:szCs w:val="20"/>
+              </w:rPr>
+              <w:t xml:space="preserve">Current password required; the new password waits for approval (Cashier → Manager or Owner, Manager → Owner)</w:t>
             </w:r>
           </w:p>
         </w:tc>
@@ -20237,7 +21825,7 @@
         <w:rPr>
           <w:rFonts w:cs="Calibri"/>
         </w:rPr>
-        <w:t>The backend detects the role from the account itself (admin → Owner, manager → Manager, staff → Cashier). Owner sees everything; Manager sees everything except Expenses; Cashier gets a separate Cashier Dashboard (today's bills, cash and due only) plus New Sale and Customers — never profit, purchase cost, expenses or reports. Typing a restricted page URL bounces the user to their home page.</w:t>
+        <w:t xml:space="preserve">The backend detects the role from the account itself (admin → Owner, manager → Manager, staff → Cashier). Owner sees everything; Manager sees everything except Expenses; Cashier gets a separate Cashier Dashboard (today's bills, cash and due only) plus New Sale, Customers and a limited Reports view (Sales, Top-Selling and Low-Stock &amp; Expiry tabs) — never profit, purchase cost, expenses, purchases or suppliers. Typing a restricted page URL bounces the user to their home page. Because every sale, purchase and expense stores its user_id, the Staff Activity report shows who recorded what.</w:t>
       </w:r>
     </w:p>
     <w:p>
@@ -20285,7 +21873,7 @@
         <w:spacing w:after="60"/>
       </w:pPr>
       <w:r>
-        <w:t>Import database.sql: phpMyAdmin → Import, or run: mysql -u root -p &lt; database.sql. The file creates the database gms_db, all 14 tables, the view v_product_live and the sample data.</w:t>
+        <w:t xml:space="preserve">Import database.sql: phpMyAdmin → Import, or run: mysql -u root -p &lt; database.sql. The file creates the database gms_db, the 14 tables of the ER diagram, the 4 supporting tables, the view v_product_live and the sample data.</w:t>
       </w:r>
     </w:p>
     <w:p>

</xml_diff>